<commit_message>
Issue #181: V2.3 Exit Export + Portability — full-system export/import (v3.0.0)
  - Export: 4 new entity types (object_term_relations, settings, users, menus) — now 15 total
  - Export: self-documenting packages with README.md + schema in manifest
  - Import: ArchiveImporter service with FK-ordered pipeline + ID remapping
  - Import: 3 modes (merge, dry_run, replace)
  - Import: CLI task (php symfony portable:import)
  - Import: 3-step web UI wizard (upload, configure, import)
  - Import: QueueService dispatch with nohup fallback
  - DB: portable_import table for job tracking
  - Docs: help guide + feature overview (.md + .docx)
  - Cron: portable:import added to AHG Settings cron jobs
</commit_message>
<xml_diff>
--- a/ahgPortableExportPlugin/docs/AtoM_Heratio_PortableExport_Feature_Overview.docx
+++ b/ahgPortableExportPlugin/docs/AtoM_Heratio_PortableExport_Feature_Overview.docx
@@ -7,7 +7,7 @@
         <w:pStyle w:val="Title"/>
       </w:pPr>
       <w:r>
-        <w:t xml:space="preserve">AtoM Heratio - Portable Export Feature Overview</w:t>
+        <w:t xml:space="preserve">AtoM Heratio — Portable Export &amp; Import Feature Overview</w:t>
       </w:r>
     </w:p>
     <w:p>
@@ -18,13 +18,22 @@
         <w:t xml:space="preserve">The Archive and Heritage Group (Pty) Ltd</w:t>
       </w:r>
     </w:p>
-    <w:bookmarkStart w:id="30" w:name="atom-heratio-portable-export-plugin"/>
+    <w:bookmarkStart w:id="35" w:name="atom-heratio-portable-export-import"/>
     <w:p>
       <w:pPr>
         <w:pStyle w:val="Heading1"/>
       </w:pPr>
       <w:r>
-        <w:t xml:space="preserve">AtoM Heratio — Portable Export Plugin</w:t>
+        <w:t xml:space="preserve">AtoM Heratio — Portable Export &amp; Import</w:t>
+      </w:r>
+    </w:p>
+    <w:bookmarkStart w:id="20" w:name="feature-overview"/>
+    <w:p>
+      <w:pPr>
+        <w:pStyle w:val="Heading2"/>
+      </w:pPr>
+      <w:r>
+        <w:t xml:space="preserve">Feature Overview</w:t>
       </w:r>
     </w:p>
     <w:p>
@@ -42,7 +51,7 @@
         <w:t xml:space="preserve"> </w:t>
       </w:r>
       <w:r>
-        <w:t xml:space="preserve">2.0.0</w:t>
+        <w:t xml:space="preserve">3.0.0</w:t>
       </w:r>
       <w:r>
         <w:t xml:space="preserve"> </w:t>
@@ -74,7 +83,7 @@
         <w:t xml:space="preserve"> </w:t>
       </w:r>
       <w:r>
-        <w:t xml:space="preserve">Export &amp; Portability</w:t>
+        <w:t xml:space="preserve">Exit Export &amp; Data Portability</w:t>
       </w:r>
     </w:p>
     <w:p>
@@ -84,7 +93,8 @@
         </w:pict>
       </w:r>
     </w:p>
-    <w:bookmarkStart w:id="20" w:name="overview"/>
+    <w:bookmarkEnd w:id="20"/>
+    <w:bookmarkStart w:id="21" w:name="overview"/>
     <w:p>
       <w:pPr>
         <w:pStyle w:val="Heading2"/>
@@ -98,7 +108,7 @@
         <w:pStyle w:val="FirstParagraph"/>
       </w:pPr>
       <w:r>
-        <w:t xml:space="preserve">The Portable Export plugin provides two distinct export modes for AtoM Heratio:</w:t>
+        <w:t xml:space="preserve">The Portable Export &amp; Import plugin provides a complete data portability solution for AtoM Heratio archival management instances. It enables institutions to:</w:t>
       </w:r>
     </w:p>
     <w:p>
@@ -107,19 +117,20 @@
           <w:ilvl w:val="0"/>
           <w:numId w:val="1001"/>
         </w:numPr>
+        <w:pStyle w:val="Compact"/>
       </w:pPr>
       <w:r>
         <w:rPr>
           <w:bCs/>
           <w:b/>
         </w:rPr>
-        <w:t xml:space="preserve">Viewer Export</w:t>
-      </w:r>
-      <w:r>
-        <w:t xml:space="preserve"> </w:t>
-      </w:r>
-      <w:r>
-        <w:t xml:space="preserve">— A self-contained HTML/JS catalogue viewer for offline access on CD, USB, or downloadable ZIP. Opens in any modern browser with no server or internet required.</w:t>
+        <w:t xml:space="preserve">Export</w:t>
+      </w:r>
+      <w:r>
+        <w:t xml:space="preserve"> </w:t>
+      </w:r>
+      <w:r>
+        <w:t xml:space="preserve">entire AtoM instances as structured, verifiable archive packages</w:t>
       </w:r>
     </w:p>
     <w:p>
@@ -128,19 +139,50 @@
           <w:ilvl w:val="0"/>
           <w:numId w:val="1001"/>
         </w:numPr>
+        <w:pStyle w:val="Compact"/>
       </w:pPr>
       <w:r>
         <w:rPr>
           <w:bCs/>
           <w:b/>
         </w:rPr>
-        <w:t xml:space="preserve">Archive Export</w:t>
-      </w:r>
-      <w:r>
-        <w:t xml:space="preserve"> </w:t>
-      </w:r>
-      <w:r>
-        <w:t xml:space="preserve">— A structured, re-importable JSON package with SHA-256 checksums for full system portability. Covers all entity types (descriptions, authorities, taxonomies, rights, accessions, physical objects, events, notes, relations, repositories) with a verifiable manifest.</w:t>
+        <w:t xml:space="preserve">Import</w:t>
+      </w:r>
+      <w:r>
+        <w:t xml:space="preserve"> </w:t>
+      </w:r>
+      <w:r>
+        <w:t xml:space="preserve">archive packages into fresh or existing instances with full ID remapping</w:t>
+      </w:r>
+    </w:p>
+    <w:p>
+      <w:pPr>
+        <w:numPr>
+          <w:ilvl w:val="0"/>
+          <w:numId w:val="1001"/>
+        </w:numPr>
+        <w:pStyle w:val="Compact"/>
+      </w:pPr>
+      <w:r>
+        <w:rPr>
+          <w:bCs/>
+          <w:b/>
+        </w:rPr>
+        <w:t xml:space="preserve">Distribute</w:t>
+      </w:r>
+      <w:r>
+        <w:t xml:space="preserve"> </w:t>
+      </w:r>
+      <w:r>
+        <w:t xml:space="preserve">offline catalogue viewers for CD, USB, or web download</w:t>
+      </w:r>
+    </w:p>
+    <w:p>
+      <w:pPr>
+        <w:pStyle w:val="FirstParagraph"/>
+      </w:pPr>
+      <w:r>
+        <w:t xml:space="preserve">This plugin satisfies the exit/portability requirement — ensuring institutions retain full control of their data and can migrate between AtoM instances without vendor lock-in.</w:t>
       </w:r>
     </w:p>
     <w:p>
@@ -150,8 +192,8 @@
         </w:pict>
       </w:r>
     </w:p>
-    <w:bookmarkEnd w:id="20"/>
-    <w:bookmarkStart w:id="24" w:name="key-features"/>
+    <w:bookmarkEnd w:id="21"/>
+    <w:bookmarkStart w:id="26" w:name="key-features"/>
     <w:p>
       <w:pPr>
         <w:pStyle w:val="Heading2"/>
@@ -160,13 +202,13 @@
         <w:t xml:space="preserve">Key Features</w:t>
       </w:r>
     </w:p>
-    <w:bookmarkStart w:id="21" w:name="viewer-export-mode"/>
+    <w:bookmarkStart w:id="22" w:name="full-system-archive-export-v3.0"/>
     <w:p>
       <w:pPr>
         <w:pStyle w:val="Heading3"/>
       </w:pPr>
       <w:r>
-        <w:t xml:space="preserve">Viewer Export Mode</w:t>
+        <w:t xml:space="preserve">Full-System Archive Export (v3.0)</w:t>
       </w:r>
     </w:p>
     <w:p>
@@ -178,7 +220,17 @@
         <w:pStyle w:val="Compact"/>
       </w:pPr>
       <w:r>
-        <w:t xml:space="preserve">Self-contained HTML/JS viewer — zero server dependencies</w:t>
+        <w:rPr>
+          <w:bCs/>
+          <w:b/>
+        </w:rPr>
+        <w:t xml:space="preserve">15 entity types</w:t>
+      </w:r>
+      <w:r>
+        <w:t xml:space="preserve"> </w:t>
+      </w:r>
+      <w:r>
+        <w:t xml:space="preserve">exported as structured JSON: descriptions, authorities, taxonomies, rights, accessions, physical objects, events, notes, relations, digital objects, repositories, access points (object-term relations), settings, users/groups, and menus</w:t>
       </w:r>
     </w:p>
     <w:p>
@@ -190,7 +242,17 @@
         <w:pStyle w:val="Compact"/>
       </w:pPr>
       <w:r>
-        <w:t xml:space="preserve">Client-side search powered by FlexSearch</w:t>
+        <w:rPr>
+          <w:bCs/>
+          <w:b/>
+        </w:rPr>
+        <w:t xml:space="preserve">SHA-256 checksummed manifest</w:t>
+      </w:r>
+      <w:r>
+        <w:t xml:space="preserve"> </w:t>
+      </w:r>
+      <w:r>
+        <w:t xml:space="preserve">for integrity verification of every file</w:t>
       </w:r>
     </w:p>
     <w:p>
@@ -202,7 +264,17 @@
         <w:pStyle w:val="Compact"/>
       </w:pPr>
       <w:r>
-        <w:t xml:space="preserve">Hierarchical tree navigation (MPTT-ordered)</w:t>
+        <w:rPr>
+          <w:bCs/>
+          <w:b/>
+        </w:rPr>
+        <w:t xml:space="preserve">Self-documenting packages</w:t>
+      </w:r>
+      <w:r>
+        <w:t xml:space="preserve"> </w:t>
+      </w:r>
+      <w:r>
+        <w:t xml:space="preserve">with README.md and schema documentation embedded in the manifest</w:t>
       </w:r>
     </w:p>
     <w:p>
@@ -214,7 +286,7 @@
         <w:pStyle w:val="Compact"/>
       </w:pPr>
       <w:r>
-        <w:t xml:space="preserve">Digital object inline viewing (images, PDFs)</w:t>
+        <w:t xml:space="preserve">Dry-run estimate before export (record counts, estimated size, duration)</w:t>
       </w:r>
     </w:p>
     <w:p>
@@ -226,7 +298,7 @@
         <w:pStyle w:val="Compact"/>
       </w:pPr>
       <w:r>
-        <w:t xml:space="preserve">Editable mode for researcher notes and file import</w:t>
+        <w:t xml:space="preserve">All i18n cultures preserved per entity</w:t>
       </w:r>
     </w:p>
     <w:p>
@@ -238,17 +310,17 @@
         <w:pStyle w:val="Compact"/>
       </w:pPr>
       <w:r>
-        <w:t xml:space="preserve">Configurable branding (title, subtitle, footer)</w:t>
-      </w:r>
-    </w:p>
-    <w:bookmarkEnd w:id="21"/>
-    <w:bookmarkStart w:id="22" w:name="archive-export-mode-v2.0"/>
+        <w:t xml:space="preserve">Sensitive data excluded (passwords, tokens, API keys)</w:t>
+      </w:r>
+    </w:p>
+    <w:bookmarkEnd w:id="22"/>
+    <w:bookmarkStart w:id="23" w:name="full-system-archive-import-v3.0"/>
     <w:p>
       <w:pPr>
         <w:pStyle w:val="Heading3"/>
       </w:pPr>
       <w:r>
-        <w:t xml:space="preserve">Archive Export Mode (v2.0)</w:t>
+        <w:t xml:space="preserve">Full-System Archive Import (v3.0)</w:t>
       </w:r>
     </w:p>
     <w:p>
@@ -260,7 +332,17 @@
         <w:pStyle w:val="Compact"/>
       </w:pPr>
       <w:r>
-        <w:t xml:space="preserve">Re-importable JSON format for full system portability</w:t>
+        <w:rPr>
+          <w:bCs/>
+          <w:b/>
+        </w:rPr>
+        <w:t xml:space="preserve">FK-dependency-ordered import pipeline</w:t>
+      </w:r>
+      <w:r>
+        <w:t xml:space="preserve"> </w:t>
+      </w:r>
+      <w:r>
+        <w:t xml:space="preserve">— entities imported in the correct order to maintain referential integrity</w:t>
       </w:r>
     </w:p>
     <w:p>
@@ -272,7 +354,17 @@
         <w:pStyle w:val="Compact"/>
       </w:pPr>
       <w:r>
-        <w:t xml:space="preserve">11 entity types: descriptions, authorities, taxonomies, rights, accessions, physical objects, events, notes, relations, digital object metadata, repositories</w:t>
+        <w:rPr>
+          <w:bCs/>
+          <w:b/>
+        </w:rPr>
+        <w:t xml:space="preserve">ID remapping</w:t>
+      </w:r>
+      <w:r>
+        <w:t xml:space="preserve"> </w:t>
+      </w:r>
+      <w:r>
+        <w:t xml:space="preserve">— all source IDs automatically mapped to new target IDs</w:t>
       </w:r>
     </w:p>
     <w:p>
@@ -284,7 +376,77 @@
         <w:pStyle w:val="Compact"/>
       </w:pPr>
       <w:r>
-        <w:t xml:space="preserve">SHA-256 checksums on all exported files</w:t>
+        <w:rPr>
+          <w:bCs/>
+          <w:b/>
+        </w:rPr>
+        <w:t xml:space="preserve">Three import modes:</w:t>
+      </w:r>
+    </w:p>
+    <w:p>
+      <w:pPr>
+        <w:numPr>
+          <w:ilvl w:val="1"/>
+          <w:numId w:val="1004"/>
+        </w:numPr>
+        <w:pStyle w:val="Compact"/>
+      </w:pPr>
+      <w:r>
+        <w:rPr>
+          <w:bCs/>
+          <w:b/>
+        </w:rPr>
+        <w:t xml:space="preserve">Merge</w:t>
+      </w:r>
+      <w:r>
+        <w:t xml:space="preserve"> </w:t>
+      </w:r>
+      <w:r>
+        <w:t xml:space="preserve">— Skip existing records, import only new (safe default)</w:t>
+      </w:r>
+    </w:p>
+    <w:p>
+      <w:pPr>
+        <w:numPr>
+          <w:ilvl w:val="1"/>
+          <w:numId w:val="1004"/>
+        </w:numPr>
+        <w:pStyle w:val="Compact"/>
+      </w:pPr>
+      <w:r>
+        <w:rPr>
+          <w:bCs/>
+          <w:b/>
+        </w:rPr>
+        <w:t xml:space="preserve">Dry Run</w:t>
+      </w:r>
+      <w:r>
+        <w:t xml:space="preserve"> </w:t>
+      </w:r>
+      <w:r>
+        <w:t xml:space="preserve">— Validate and report without database changes</w:t>
+      </w:r>
+    </w:p>
+    <w:p>
+      <w:pPr>
+        <w:numPr>
+          <w:ilvl w:val="1"/>
+          <w:numId w:val="1004"/>
+        </w:numPr>
+        <w:pStyle w:val="Compact"/>
+      </w:pPr>
+      <w:r>
+        <w:rPr>
+          <w:bCs/>
+          <w:b/>
+        </w:rPr>
+        <w:t xml:space="preserve">Replace</w:t>
+      </w:r>
+      <w:r>
+        <w:t xml:space="preserve"> </w:t>
+      </w:r>
+      <w:r>
+        <w:t xml:space="preserve">— Clear and re-import (with confirmation safeguards)</w:t>
       </w:r>
     </w:p>
     <w:p>
@@ -296,7 +458,7 @@
         <w:pStyle w:val="Compact"/>
       </w:pPr>
       <w:r>
-        <w:t xml:space="preserve">Manifest with entity counts, source metadata, and file inventory</w:t>
+        <w:t xml:space="preserve">Digital object file copying — asset files transferred to correct upload paths</w:t>
       </w:r>
     </w:p>
     <w:p>
@@ -308,658 +470,17 @@
         <w:pStyle w:val="Compact"/>
       </w:pPr>
       <w:r>
-        <w:t xml:space="preserve">Dry-run estimate before export (record counts, estimated size, duration)</w:t>
-      </w:r>
-    </w:p>
-    <w:p>
-      <w:pPr>
-        <w:numPr>
-          <w:ilvl w:val="0"/>
-          <w:numId w:val="1003"/>
-        </w:numPr>
-        <w:pStyle w:val="Compact"/>
-      </w:pPr>
-      <w:r>
-        <w:t xml:space="preserve">Export verification CLI command</w:t>
-      </w:r>
-    </w:p>
-    <w:p>
-      <w:pPr>
-        <w:numPr>
-          <w:ilvl w:val="0"/>
-          <w:numId w:val="1003"/>
-        </w:numPr>
-        <w:pStyle w:val="Compact"/>
-      </w:pPr>
-      <w:r>
-        <w:t xml:space="preserve">All i18n cultures preserved per entity</w:t>
-      </w:r>
-    </w:p>
-    <w:bookmarkEnd w:id="22"/>
-    <w:bookmarkStart w:id="23" w:name="shared-features"/>
+        <w:t xml:space="preserve">Secure user import — user accounts imported without passwords (must be reset)</w:t>
+      </w:r>
+    </w:p>
+    <w:bookmarkEnd w:id="23"/>
+    <w:bookmarkStart w:id="24" w:name="viewer-export-mode"/>
     <w:p>
       <w:pPr>
         <w:pStyle w:val="Heading3"/>
       </w:pPr>
       <w:r>
-        <w:t xml:space="preserve">Shared Features</w:t>
-      </w:r>
-    </w:p>
-    <w:p>
-      <w:pPr>
-        <w:numPr>
-          <w:ilvl w:val="0"/>
-          <w:numId w:val="1004"/>
-        </w:numPr>
-        <w:pStyle w:val="Compact"/>
-      </w:pPr>
-      <w:r>
-        <w:t xml:space="preserve">Export scopes: entire catalogue, specific fonds, by repository, custom (clipboard)</w:t>
-      </w:r>
-    </w:p>
-    <w:p>
-      <w:pPr>
-        <w:numPr>
-          <w:ilvl w:val="0"/>
-          <w:numId w:val="1004"/>
-        </w:numPr>
-        <w:pStyle w:val="Compact"/>
-      </w:pPr>
-      <w:r>
-        <w:t xml:space="preserve">Background processing with progress tracking (via QueueService or nohup fallback)</w:t>
-      </w:r>
-    </w:p>
-    <w:p>
-      <w:pPr>
-        <w:numPr>
-          <w:ilvl w:val="0"/>
-          <w:numId w:val="1004"/>
-        </w:numPr>
-        <w:pStyle w:val="Compact"/>
-      </w:pPr>
-      <w:r>
-        <w:t xml:space="preserve">Admin UI with 4-step wizard</w:t>
-      </w:r>
-    </w:p>
-    <w:p>
-      <w:pPr>
-        <w:numPr>
-          <w:ilvl w:val="0"/>
-          <w:numId w:val="1004"/>
-        </w:numPr>
-        <w:pStyle w:val="Compact"/>
-      </w:pPr>
-      <w:r>
-        <w:t xml:space="preserve">Secure download tokens for sharing (time-limited, download-limited)</w:t>
-      </w:r>
-    </w:p>
-    <w:p>
-      <w:pPr>
-        <w:numPr>
-          <w:ilvl w:val="0"/>
-          <w:numId w:val="1004"/>
-        </w:numPr>
-        <w:pStyle w:val="Compact"/>
-      </w:pPr>
-      <w:r>
-        <w:t xml:space="preserve">CLI commands for automation</w:t>
-      </w:r>
-    </w:p>
-    <w:p>
-      <w:pPr>
-        <w:numPr>
-          <w:ilvl w:val="0"/>
-          <w:numId w:val="1004"/>
-        </w:numPr>
-        <w:pStyle w:val="Compact"/>
-      </w:pPr>
-      <w:r>
-        <w:t xml:space="preserve">Automatic retention and cleanup</w:t>
-      </w:r>
-    </w:p>
-    <w:p>
-      <w:r>
-        <w:pict>
-          <v:rect style="width:0;height:1.5pt" o:hralign="center" o:hrstd="t" o:hr="t"/>
-        </w:pict>
-      </w:r>
-    </w:p>
-    <w:bookmarkEnd w:id="23"/>
-    <w:bookmarkEnd w:id="24"/>
-    <w:bookmarkStart w:id="25" w:name="cli-commands"/>
-    <w:p>
-      <w:pPr>
-        <w:pStyle w:val="Heading2"/>
-      </w:pPr>
-      <w:r>
-        <w:t xml:space="preserve">CLI Commands</w:t>
-      </w:r>
-    </w:p>
-    <w:p>
-      <w:pPr>
-        <w:pStyle w:val="SourceCode"/>
-      </w:pPr>
-      <w:r>
-        <w:rPr>
-          <w:rStyle w:val="CommentTok"/>
-        </w:rPr>
-        <w:t xml:space="preserve"># Viewer export</w:t>
-      </w:r>
-      <w:r>
-        <w:br/>
-      </w:r>
-      <w:r>
-        <w:rPr>
-          <w:rStyle w:val="ExtensionTok"/>
-        </w:rPr>
-        <w:t xml:space="preserve">php</w:t>
-      </w:r>
-      <w:r>
-        <w:rPr>
-          <w:rStyle w:val="NormalTok"/>
-        </w:rPr>
-        <w:t xml:space="preserve"> symfony portable:export </w:t>
-      </w:r>
-      <w:r>
-        <w:rPr>
-          <w:rStyle w:val="AttributeTok"/>
-        </w:rPr>
-        <w:t xml:space="preserve">--scope</w:t>
-      </w:r>
-      <w:r>
-        <w:rPr>
-          <w:rStyle w:val="OperatorTok"/>
-        </w:rPr>
-        <w:t xml:space="preserve">=</w:t>
-      </w:r>
-      <w:r>
-        <w:rPr>
-          <w:rStyle w:val="NormalTok"/>
-        </w:rPr>
-        <w:t xml:space="preserve">all </w:t>
-      </w:r>
-      <w:r>
-        <w:rPr>
-          <w:rStyle w:val="AttributeTok"/>
-        </w:rPr>
-        <w:t xml:space="preserve">--zip</w:t>
-      </w:r>
-      <w:r>
-        <w:br/>
-      </w:r>
-      <w:r>
-        <w:rPr>
-          <w:rStyle w:val="ExtensionTok"/>
-        </w:rPr>
-        <w:t xml:space="preserve">php</w:t>
-      </w:r>
-      <w:r>
-        <w:rPr>
-          <w:rStyle w:val="NormalTok"/>
-        </w:rPr>
-        <w:t xml:space="preserve"> symfony portable:export </w:t>
-      </w:r>
-      <w:r>
-        <w:rPr>
-          <w:rStyle w:val="AttributeTok"/>
-        </w:rPr>
-        <w:t xml:space="preserve">--scope</w:t>
-      </w:r>
-      <w:r>
-        <w:rPr>
-          <w:rStyle w:val="OperatorTok"/>
-        </w:rPr>
-        <w:t xml:space="preserve">=</w:t>
-      </w:r>
-      <w:r>
-        <w:rPr>
-          <w:rStyle w:val="NormalTok"/>
-        </w:rPr>
-        <w:t xml:space="preserve">fonds </w:t>
-      </w:r>
-      <w:r>
-        <w:rPr>
-          <w:rStyle w:val="AttributeTok"/>
-        </w:rPr>
-        <w:t xml:space="preserve">--slug</w:t>
-      </w:r>
-      <w:r>
-        <w:rPr>
-          <w:rStyle w:val="OperatorTok"/>
-        </w:rPr>
-        <w:t xml:space="preserve">=</w:t>
-      </w:r>
-      <w:r>
-        <w:rPr>
-          <w:rStyle w:val="NormalTok"/>
-        </w:rPr>
-        <w:t xml:space="preserve">my-fonds </w:t>
-      </w:r>
-      <w:r>
-        <w:rPr>
-          <w:rStyle w:val="AttributeTok"/>
-        </w:rPr>
-        <w:t xml:space="preserve">--mode</w:t>
-      </w:r>
-      <w:r>
-        <w:rPr>
-          <w:rStyle w:val="OperatorTok"/>
-        </w:rPr>
-        <w:t xml:space="preserve">=</w:t>
-      </w:r>
-      <w:r>
-        <w:rPr>
-          <w:rStyle w:val="NormalTok"/>
-        </w:rPr>
-        <w:t xml:space="preserve">read_only</w:t>
-      </w:r>
-      <w:r>
-        <w:br/>
-      </w:r>
-      <w:r>
-        <w:br/>
-      </w:r>
-      <w:r>
-        <w:rPr>
-          <w:rStyle w:val="CommentTok"/>
-        </w:rPr>
-        <w:t xml:space="preserve"># Archive export</w:t>
-      </w:r>
-      <w:r>
-        <w:br/>
-      </w:r>
-      <w:r>
-        <w:rPr>
-          <w:rStyle w:val="ExtensionTok"/>
-        </w:rPr>
-        <w:t xml:space="preserve">php</w:t>
-      </w:r>
-      <w:r>
-        <w:rPr>
-          <w:rStyle w:val="NormalTok"/>
-        </w:rPr>
-        <w:t xml:space="preserve"> symfony portable:export </w:t>
-      </w:r>
-      <w:r>
-        <w:rPr>
-          <w:rStyle w:val="AttributeTok"/>
-        </w:rPr>
-        <w:t xml:space="preserve">--scope</w:t>
-      </w:r>
-      <w:r>
-        <w:rPr>
-          <w:rStyle w:val="OperatorTok"/>
-        </w:rPr>
-        <w:t xml:space="preserve">=</w:t>
-      </w:r>
-      <w:r>
-        <w:rPr>
-          <w:rStyle w:val="NormalTok"/>
-        </w:rPr>
-        <w:t xml:space="preserve">all </w:t>
-      </w:r>
-      <w:r>
-        <w:rPr>
-          <w:rStyle w:val="AttributeTok"/>
-        </w:rPr>
-        <w:t xml:space="preserve">--mode</w:t>
-      </w:r>
-      <w:r>
-        <w:rPr>
-          <w:rStyle w:val="OperatorTok"/>
-        </w:rPr>
-        <w:t xml:space="preserve">=</w:t>
-      </w:r>
-      <w:r>
-        <w:rPr>
-          <w:rStyle w:val="NormalTok"/>
-        </w:rPr>
-        <w:t xml:space="preserve">archive </w:t>
-      </w:r>
-      <w:r>
-        <w:rPr>
-          <w:rStyle w:val="AttributeTok"/>
-        </w:rPr>
-        <w:t xml:space="preserve">--zip</w:t>
-      </w:r>
-      <w:r>
-        <w:br/>
-      </w:r>
-      <w:r>
-        <w:rPr>
-          <w:rStyle w:val="ExtensionTok"/>
-        </w:rPr>
-        <w:t xml:space="preserve">php</w:t>
-      </w:r>
-      <w:r>
-        <w:rPr>
-          <w:rStyle w:val="NormalTok"/>
-        </w:rPr>
-        <w:t xml:space="preserve"> symfony portable:export </w:t>
-      </w:r>
-      <w:r>
-        <w:rPr>
-          <w:rStyle w:val="AttributeTok"/>
-        </w:rPr>
-        <w:t xml:space="preserve">--scope</w:t>
-      </w:r>
-      <w:r>
-        <w:rPr>
-          <w:rStyle w:val="OperatorTok"/>
-        </w:rPr>
-        <w:t xml:space="preserve">=</w:t>
-      </w:r>
-      <w:r>
-        <w:rPr>
-          <w:rStyle w:val="NormalTok"/>
-        </w:rPr>
-        <w:t xml:space="preserve">repository </w:t>
-      </w:r>
-      <w:r>
-        <w:rPr>
-          <w:rStyle w:val="AttributeTok"/>
-        </w:rPr>
-        <w:t xml:space="preserve">--repository-id</w:t>
-      </w:r>
-      <w:r>
-        <w:rPr>
-          <w:rStyle w:val="OperatorTok"/>
-        </w:rPr>
-        <w:t xml:space="preserve">=</w:t>
-      </w:r>
-      <w:r>
-        <w:rPr>
-          <w:rStyle w:val="NormalTok"/>
-        </w:rPr>
-        <w:t xml:space="preserve">5 </w:t>
-      </w:r>
-      <w:r>
-        <w:rPr>
-          <w:rStyle w:val="AttributeTok"/>
-        </w:rPr>
-        <w:t xml:space="preserve">--mode</w:t>
-      </w:r>
-      <w:r>
-        <w:rPr>
-          <w:rStyle w:val="OperatorTok"/>
-        </w:rPr>
-        <w:t xml:space="preserve">=</w:t>
-      </w:r>
-      <w:r>
-        <w:rPr>
-          <w:rStyle w:val="NormalTok"/>
-        </w:rPr>
-        <w:t xml:space="preserve">archive</w:t>
-      </w:r>
-      <w:r>
-        <w:br/>
-      </w:r>
-      <w:r>
-        <w:br/>
-      </w:r>
-      <w:r>
-        <w:rPr>
-          <w:rStyle w:val="CommentTok"/>
-        </w:rPr>
-        <w:t xml:space="preserve"># Verify an archive export</w:t>
-      </w:r>
-      <w:r>
-        <w:br/>
-      </w:r>
-      <w:r>
-        <w:rPr>
-          <w:rStyle w:val="ExtensionTok"/>
-        </w:rPr>
-        <w:t xml:space="preserve">php</w:t>
-      </w:r>
-      <w:r>
-        <w:rPr>
-          <w:rStyle w:val="NormalTok"/>
-        </w:rPr>
-        <w:t xml:space="preserve"> symfony portable:verify </w:t>
-      </w:r>
-      <w:r>
-        <w:rPr>
-          <w:rStyle w:val="AttributeTok"/>
-        </w:rPr>
-        <w:t xml:space="preserve">--path</w:t>
-      </w:r>
-      <w:r>
-        <w:rPr>
-          <w:rStyle w:val="OperatorTok"/>
-        </w:rPr>
-        <w:t xml:space="preserve">=</w:t>
-      </w:r>
-      <w:r>
-        <w:rPr>
-          <w:rStyle w:val="NormalTok"/>
-        </w:rPr>
-        <w:t xml:space="preserve">/path/to/export.zip</w:t>
-      </w:r>
-      <w:r>
-        <w:br/>
-      </w:r>
-      <w:r>
-        <w:br/>
-      </w:r>
-      <w:r>
-        <w:rPr>
-          <w:rStyle w:val="CommentTok"/>
-        </w:rPr>
-        <w:t xml:space="preserve"># Clean up expired exports</w:t>
-      </w:r>
-      <w:r>
-        <w:br/>
-      </w:r>
-      <w:r>
-        <w:rPr>
-          <w:rStyle w:val="ExtensionTok"/>
-        </w:rPr>
-        <w:t xml:space="preserve">php</w:t>
-      </w:r>
-      <w:r>
-        <w:rPr>
-          <w:rStyle w:val="NormalTok"/>
-        </w:rPr>
-        <w:t xml:space="preserve"> symfony portable:cleanup</w:t>
-      </w:r>
-    </w:p>
-    <w:p>
-      <w:r>
-        <w:pict>
-          <v:rect style="width:0;height:1.5pt" o:hralign="center" o:hrstd="t" o:hr="t"/>
-        </w:pict>
-      </w:r>
-    </w:p>
-    <w:bookmarkEnd w:id="25"/>
-    <w:bookmarkStart w:id="26" w:name="archive-export-package-structure"/>
-    <w:p>
-      <w:pPr>
-        <w:pStyle w:val="Heading2"/>
-      </w:pPr>
-      <w:r>
-        <w:t xml:space="preserve">Archive Export Package Structure</w:t>
-      </w:r>
-    </w:p>
-    <w:p>
-      <w:pPr>
-        <w:pStyle w:val="SourceCode"/>
-      </w:pPr>
-      <w:r>
-        <w:rPr>
-          <w:rStyle w:val="VerbatimChar"/>
-        </w:rPr>
-        <w:t xml:space="preserve">export-{id}/</w:t>
-      </w:r>
-      <w:r>
-        <w:br/>
-      </w:r>
-      <w:r>
-        <w:rPr>
-          <w:rStyle w:val="VerbatimChar"/>
-        </w:rPr>
-        <w:t xml:space="preserve">  manifest.json          # Checksums, entity counts, export metadata</w:t>
-      </w:r>
-      <w:r>
-        <w:br/>
-      </w:r>
-      <w:r>
-        <w:rPr>
-          <w:rStyle w:val="VerbatimChar"/>
-        </w:rPr>
-        <w:t xml:space="preserve">  data/</w:t>
-      </w:r>
-      <w:r>
-        <w:br/>
-      </w:r>
-      <w:r>
-        <w:rPr>
-          <w:rStyle w:val="VerbatimChar"/>
-        </w:rPr>
-        <w:t xml:space="preserve">    descriptions.json    # ISAD(G) fields + all i18n + properties</w:t>
-      </w:r>
-      <w:r>
-        <w:br/>
-      </w:r>
-      <w:r>
-        <w:rPr>
-          <w:rStyle w:val="VerbatimChar"/>
-        </w:rPr>
-        <w:t xml:space="preserve">    authorities.json     # Actors with type, dates, relations</w:t>
-      </w:r>
-      <w:r>
-        <w:br/>
-      </w:r>
-      <w:r>
-        <w:rPr>
-          <w:rStyle w:val="VerbatimChar"/>
-        </w:rPr>
-        <w:t xml:space="preserve">    taxonomies.json      # Full taxonomy trees with parent-child</w:t>
-      </w:r>
-      <w:r>
-        <w:br/>
-      </w:r>
-      <w:r>
-        <w:rPr>
-          <w:rStyle w:val="VerbatimChar"/>
-        </w:rPr>
-        <w:t xml:space="preserve">    rights.json          # Rights statements linked to objects</w:t>
-      </w:r>
-      <w:r>
-        <w:br/>
-      </w:r>
-      <w:r>
-        <w:rPr>
-          <w:rStyle w:val="VerbatimChar"/>
-        </w:rPr>
-        <w:t xml:space="preserve">    accessions.json      # Accession records + events + donors</w:t>
-      </w:r>
-      <w:r>
-        <w:br/>
-      </w:r>
-      <w:r>
-        <w:rPr>
-          <w:rStyle w:val="VerbatimChar"/>
-        </w:rPr>
-        <w:t xml:space="preserve">    physical_objects.json# Storage locations</w:t>
-      </w:r>
-      <w:r>
-        <w:br/>
-      </w:r>
-      <w:r>
-        <w:rPr>
-          <w:rStyle w:val="VerbatimChar"/>
-        </w:rPr>
-        <w:t xml:space="preserve">    events.json          # Events linked to descriptions</w:t>
-      </w:r>
-      <w:r>
-        <w:br/>
-      </w:r>
-      <w:r>
-        <w:rPr>
-          <w:rStyle w:val="VerbatimChar"/>
-        </w:rPr>
-        <w:t xml:space="preserve">    notes.json           # Notes by type</w:t>
-      </w:r>
-      <w:r>
-        <w:br/>
-      </w:r>
-      <w:r>
-        <w:rPr>
-          <w:rStyle w:val="VerbatimChar"/>
-        </w:rPr>
-        <w:t xml:space="preserve">    relations.json       # Inter-entity relationships</w:t>
-      </w:r>
-      <w:r>
-        <w:br/>
-      </w:r>
-      <w:r>
-        <w:rPr>
-          <w:rStyle w:val="VerbatimChar"/>
-        </w:rPr>
-        <w:t xml:space="preserve">    digital_objects.json # Digital object metadata</w:t>
-      </w:r>
-      <w:r>
-        <w:br/>
-      </w:r>
-      <w:r>
-        <w:rPr>
-          <w:rStyle w:val="VerbatimChar"/>
-        </w:rPr>
-        <w:t xml:space="preserve">    repositories.json    # Repository metadata + contacts</w:t>
-      </w:r>
-      <w:r>
-        <w:br/>
-      </w:r>
-      <w:r>
-        <w:rPr>
-          <w:rStyle w:val="VerbatimChar"/>
-        </w:rPr>
-        <w:t xml:space="preserve">  objects/               # Digital object files (if included)</w:t>
-      </w:r>
-      <w:r>
-        <w:br/>
-      </w:r>
-      <w:r>
-        <w:rPr>
-          <w:rStyle w:val="VerbatimChar"/>
-        </w:rPr>
-        <w:t xml:space="preserve">    thumbnails/</w:t>
-      </w:r>
-      <w:r>
-        <w:br/>
-      </w:r>
-      <w:r>
-        <w:rPr>
-          <w:rStyle w:val="VerbatimChar"/>
-        </w:rPr>
-        <w:t xml:space="preserve">    references/</w:t>
-      </w:r>
-      <w:r>
-        <w:br/>
-      </w:r>
-      <w:r>
-        <w:rPr>
-          <w:rStyle w:val="VerbatimChar"/>
-        </w:rPr>
-        <w:t xml:space="preserve">    masters/</w:t>
-      </w:r>
-    </w:p>
-    <w:p>
-      <w:r>
-        <w:pict>
-          <v:rect style="width:0;height:1.5pt" o:hralign="center" o:hrstd="t" o:hr="t"/>
-        </w:pict>
-      </w:r>
-    </w:p>
-    <w:bookmarkEnd w:id="26"/>
-    <w:bookmarkStart w:id="27" w:name="technical-requirements"/>
-    <w:p>
-      <w:pPr>
-        <w:pStyle w:val="Heading2"/>
-      </w:pPr>
-      <w:r>
-        <w:t xml:space="preserve">Technical Requirements</w:t>
+        <w:t xml:space="preserve">Viewer Export Mode</w:t>
       </w:r>
     </w:p>
     <w:p>
@@ -971,7 +492,7 @@
         <w:pStyle w:val="Compact"/>
       </w:pPr>
       <w:r>
-        <w:t xml:space="preserve">AtoM Heratio Framework v2.0+</w:t>
+        <w:t xml:space="preserve">Self-contained HTML/JS viewer — zero server dependencies</w:t>
       </w:r>
     </w:p>
     <w:p>
@@ -983,7 +504,7 @@
         <w:pStyle w:val="Compact"/>
       </w:pPr>
       <w:r>
-        <w:t xml:space="preserve">PHP 8.1+</w:t>
+        <w:t xml:space="preserve">Client-side search powered by FlexSearch</w:t>
       </w:r>
     </w:p>
     <w:p>
@@ -995,7 +516,7 @@
         <w:pStyle w:val="Compact"/>
       </w:pPr>
       <w:r>
-        <w:t xml:space="preserve">MySQL 8.0+</w:t>
+        <w:t xml:space="preserve">Hierarchical tree navigation (MPTT-ordered)</w:t>
       </w:r>
     </w:p>
     <w:p>
@@ -1007,24 +528,41 @@
         <w:pStyle w:val="Compact"/>
       </w:pPr>
       <w:r>
-        <w:t xml:space="preserve">ahgCorePlugin (dependency)</w:t>
-      </w:r>
-    </w:p>
-    <w:p>
-      <w:r>
-        <w:pict>
-          <v:rect style="width:0;height:1.5pt" o:hralign="center" o:hrstd="t" o:hr="t"/>
-        </w:pict>
-      </w:r>
-    </w:p>
-    <w:bookmarkEnd w:id="27"/>
-    <w:bookmarkStart w:id="28" w:name="compliance-standards"/>
-    <w:p>
-      <w:pPr>
-        <w:pStyle w:val="Heading2"/>
-      </w:pPr>
-      <w:r>
-        <w:t xml:space="preserve">Compliance &amp; Standards</w:t>
+        <w:t xml:space="preserve">Digital object inline viewing (images, PDFs)</w:t>
+      </w:r>
+    </w:p>
+    <w:p>
+      <w:pPr>
+        <w:numPr>
+          <w:ilvl w:val="0"/>
+          <w:numId w:val="1005"/>
+        </w:numPr>
+        <w:pStyle w:val="Compact"/>
+      </w:pPr>
+      <w:r>
+        <w:t xml:space="preserve">Editable mode for researcher notes and file import</w:t>
+      </w:r>
+    </w:p>
+    <w:p>
+      <w:pPr>
+        <w:numPr>
+          <w:ilvl w:val="0"/>
+          <w:numId w:val="1005"/>
+        </w:numPr>
+        <w:pStyle w:val="Compact"/>
+      </w:pPr>
+      <w:r>
+        <w:t xml:space="preserve">Configurable branding (title, subtitle, footer)</w:t>
+      </w:r>
+    </w:p>
+    <w:bookmarkEnd w:id="24"/>
+    <w:bookmarkStart w:id="25" w:name="shared-features"/>
+    <w:p>
+      <w:pPr>
+        <w:pStyle w:val="Heading3"/>
+      </w:pPr>
+      <w:r>
+        <w:t xml:space="preserve">Shared Features</w:t>
       </w:r>
     </w:p>
     <w:p>
@@ -1036,7 +574,7 @@
         <w:pStyle w:val="Compact"/>
       </w:pPr>
       <w:r>
-        <w:t xml:space="preserve">Supports OAIS-aligned export packaging</w:t>
+        <w:t xml:space="preserve">Export scopes: entire catalogue, specific fonds, by repository, custom (clipboard)</w:t>
       </w:r>
     </w:p>
     <w:p>
@@ -1048,7 +586,7 @@
         <w:pStyle w:val="Compact"/>
       </w:pPr>
       <w:r>
-        <w:t xml:space="preserve">SHA-256 file integrity verification</w:t>
+        <w:t xml:space="preserve">Background processing with progress tracking (via QueueService or nohup fallback)</w:t>
       </w:r>
     </w:p>
     <w:p>
@@ -1060,7 +598,7 @@
         <w:pStyle w:val="Compact"/>
       </w:pPr>
       <w:r>
-        <w:t xml:space="preserve">Full audit trail integration</w:t>
+        <w:t xml:space="preserve">Admin UI: 4-step export wizard + 3-step import wizard</w:t>
       </w:r>
     </w:p>
     <w:p>
@@ -1072,7 +610,31 @@
         <w:pStyle w:val="Compact"/>
       </w:pPr>
       <w:r>
-        <w:t xml:space="preserve">Compatible with NARSSA/POPIA archival requirements</w:t>
+        <w:t xml:space="preserve">Secure download tokens for sharing (time-limited, download-limited)</w:t>
+      </w:r>
+    </w:p>
+    <w:p>
+      <w:pPr>
+        <w:numPr>
+          <w:ilvl w:val="0"/>
+          <w:numId w:val="1006"/>
+        </w:numPr>
+        <w:pStyle w:val="Compact"/>
+      </w:pPr>
+      <w:r>
+        <w:t xml:space="preserve">CLI commands for automation (export, import, verify, cleanup)</w:t>
+      </w:r>
+    </w:p>
+    <w:p>
+      <w:pPr>
+        <w:numPr>
+          <w:ilvl w:val="0"/>
+          <w:numId w:val="1006"/>
+        </w:numPr>
+        <w:pStyle w:val="Compact"/>
+      </w:pPr>
+      <w:r>
+        <w:t xml:space="preserve">Automatic retention and cleanup</w:t>
       </w:r>
     </w:p>
     <w:p>
@@ -1082,143 +644,464 @@
         </w:pict>
       </w:r>
     </w:p>
-    <w:bookmarkEnd w:id="28"/>
-    <w:bookmarkStart w:id="29" w:name="admin-ui"/>
+    <w:bookmarkEnd w:id="25"/>
+    <w:bookmarkEnd w:id="26"/>
+    <w:bookmarkStart w:id="27" w:name="cli-commands"/>
     <w:p>
       <w:pPr>
         <w:pStyle w:val="Heading2"/>
       </w:pPr>
       <w:r>
-        <w:t xml:space="preserve">Admin UI</w:t>
-      </w:r>
-    </w:p>
-    <w:p>
-      <w:pPr>
-        <w:pStyle w:val="FirstParagraph"/>
-      </w:pPr>
-      <w:r>
-        <w:t xml:space="preserve">Access via</w:t>
-      </w:r>
-      <w:r>
-        <w:t xml:space="preserve"> </w:t>
-      </w:r>
-      <w:r>
-        <w:rPr>
-          <w:bCs/>
-          <w:b/>
-        </w:rPr>
-        <w:t xml:space="preserve">Admin &gt; Portable Export</w:t>
-      </w:r>
-      <w:r>
-        <w:t xml:space="preserve"> </w:t>
-      </w:r>
-      <w:r>
-        <w:t xml:space="preserve">(</w:t>
-      </w:r>
-      <w:r>
-        <w:rPr>
-          <w:rStyle w:val="VerbatimChar"/>
-        </w:rPr>
-        <w:t xml:space="preserve">/portable-export</w:t>
-      </w:r>
-      <w:r>
-        <w:t xml:space="preserve">).</w:t>
-      </w:r>
-    </w:p>
-    <w:p>
-      <w:pPr>
-        <w:pStyle w:val="BodyText"/>
-      </w:pPr>
-      <w:r>
-        <w:t xml:space="preserve">The 4-step wizard guides through:</w:t>
-      </w:r>
-      <w:r>
-        <w:t xml:space="preserve"> </w:t>
-      </w:r>
-      <w:r>
-        <w:t xml:space="preserve">1.</w:t>
-      </w:r>
-      <w:r>
-        <w:t xml:space="preserve"> </w:t>
-      </w:r>
-      <w:r>
-        <w:rPr>
-          <w:bCs/>
-          <w:b/>
-        </w:rPr>
-        <w:t xml:space="preserve">Scope</w:t>
-      </w:r>
-      <w:r>
-        <w:t xml:space="preserve"> </w:t>
-      </w:r>
-      <w:r>
-        <w:t xml:space="preserve">— Select what to export (all, fonds, repository)</w:t>
-      </w:r>
-      <w:r>
-        <w:t xml:space="preserve"> </w:t>
-      </w:r>
-      <w:r>
-        <w:t xml:space="preserve">2.</w:t>
-      </w:r>
-      <w:r>
-        <w:t xml:space="preserve"> </w:t>
-      </w:r>
-      <w:r>
-        <w:rPr>
-          <w:bCs/>
-          <w:b/>
-        </w:rPr>
-        <w:t xml:space="preserve">Content</w:t>
-      </w:r>
-      <w:r>
-        <w:t xml:space="preserve"> </w:t>
-      </w:r>
-      <w:r>
-        <w:t xml:space="preserve">— Choose export type (Viewer/Archive), entity types, digital objects</w:t>
-      </w:r>
-      <w:r>
-        <w:t xml:space="preserve"> </w:t>
-      </w:r>
-      <w:r>
-        <w:t xml:space="preserve">3.</w:t>
-      </w:r>
-      <w:r>
-        <w:t xml:space="preserve"> </w:t>
-      </w:r>
-      <w:r>
-        <w:rPr>
-          <w:bCs/>
-          <w:b/>
-        </w:rPr>
-        <w:t xml:space="preserve">Configure</w:t>
-      </w:r>
-      <w:r>
-        <w:t xml:space="preserve"> </w:t>
-      </w:r>
-      <w:r>
-        <w:t xml:space="preserve">— Title, language, branding</w:t>
-      </w:r>
-      <w:r>
-        <w:t xml:space="preserve"> </w:t>
-      </w:r>
-      <w:r>
-        <w:t xml:space="preserve">4.</w:t>
-      </w:r>
-      <w:r>
-        <w:t xml:space="preserve"> </w:t>
-      </w:r>
-      <w:r>
-        <w:rPr>
-          <w:bCs/>
-          <w:b/>
-        </w:rPr>
-        <w:t xml:space="preserve">Generate</w:t>
-      </w:r>
-      <w:r>
-        <w:t xml:space="preserve"> </w:t>
-      </w:r>
-      <w:r>
-        <w:t xml:space="preserve">— Review settings, start export, monitor progress</w:t>
+        <w:t xml:space="preserve">CLI Commands</w:t>
+      </w:r>
+    </w:p>
+    <w:p>
+      <w:pPr>
+        <w:pStyle w:val="SourceCode"/>
+      </w:pPr>
+      <w:r>
+        <w:rPr>
+          <w:rStyle w:val="CommentTok"/>
+        </w:rPr>
+        <w:t xml:space="preserve"># Archive export (full system, 15 entity types)</w:t>
+      </w:r>
+      <w:r>
+        <w:br/>
+      </w:r>
+      <w:r>
+        <w:rPr>
+          <w:rStyle w:val="ExtensionTok"/>
+        </w:rPr>
+        <w:t xml:space="preserve">php</w:t>
+      </w:r>
+      <w:r>
+        <w:rPr>
+          <w:rStyle w:val="NormalTok"/>
+        </w:rPr>
+        <w:t xml:space="preserve"> symfony portable:export </w:t>
+      </w:r>
+      <w:r>
+        <w:rPr>
+          <w:rStyle w:val="AttributeTok"/>
+        </w:rPr>
+        <w:t xml:space="preserve">--scope</w:t>
+      </w:r>
+      <w:r>
+        <w:rPr>
+          <w:rStyle w:val="OperatorTok"/>
+        </w:rPr>
+        <w:t xml:space="preserve">=</w:t>
+      </w:r>
+      <w:r>
+        <w:rPr>
+          <w:rStyle w:val="NormalTok"/>
+        </w:rPr>
+        <w:t xml:space="preserve">all </w:t>
+      </w:r>
+      <w:r>
+        <w:rPr>
+          <w:rStyle w:val="AttributeTok"/>
+        </w:rPr>
+        <w:t xml:space="preserve">--mode</w:t>
+      </w:r>
+      <w:r>
+        <w:rPr>
+          <w:rStyle w:val="OperatorTok"/>
+        </w:rPr>
+        <w:t xml:space="preserve">=</w:t>
+      </w:r>
+      <w:r>
+        <w:rPr>
+          <w:rStyle w:val="NormalTok"/>
+        </w:rPr>
+        <w:t xml:space="preserve">archive </w:t>
+      </w:r>
+      <w:r>
+        <w:rPr>
+          <w:rStyle w:val="AttributeTok"/>
+        </w:rPr>
+        <w:t xml:space="preserve">--zip</w:t>
+      </w:r>
+      <w:r>
+        <w:br/>
+      </w:r>
+      <w:r>
+        <w:br/>
+      </w:r>
+      <w:r>
+        <w:rPr>
+          <w:rStyle w:val="CommentTok"/>
+        </w:rPr>
+        <w:t xml:space="preserve"># Viewer export</w:t>
+      </w:r>
+      <w:r>
+        <w:br/>
+      </w:r>
+      <w:r>
+        <w:rPr>
+          <w:rStyle w:val="ExtensionTok"/>
+        </w:rPr>
+        <w:t xml:space="preserve">php</w:t>
+      </w:r>
+      <w:r>
+        <w:rPr>
+          <w:rStyle w:val="NormalTok"/>
+        </w:rPr>
+        <w:t xml:space="preserve"> symfony portable:export </w:t>
+      </w:r>
+      <w:r>
+        <w:rPr>
+          <w:rStyle w:val="AttributeTok"/>
+        </w:rPr>
+        <w:t xml:space="preserve">--scope</w:t>
+      </w:r>
+      <w:r>
+        <w:rPr>
+          <w:rStyle w:val="OperatorTok"/>
+        </w:rPr>
+        <w:t xml:space="preserve">=</w:t>
+      </w:r>
+      <w:r>
+        <w:rPr>
+          <w:rStyle w:val="NormalTok"/>
+        </w:rPr>
+        <w:t xml:space="preserve">all </w:t>
+      </w:r>
+      <w:r>
+        <w:rPr>
+          <w:rStyle w:val="AttributeTok"/>
+        </w:rPr>
+        <w:t xml:space="preserve">--zip</w:t>
+      </w:r>
+      <w:r>
+        <w:br/>
+      </w:r>
+      <w:r>
+        <w:rPr>
+          <w:rStyle w:val="ExtensionTok"/>
+        </w:rPr>
+        <w:t xml:space="preserve">php</w:t>
+      </w:r>
+      <w:r>
+        <w:rPr>
+          <w:rStyle w:val="NormalTok"/>
+        </w:rPr>
+        <w:t xml:space="preserve"> symfony portable:export </w:t>
+      </w:r>
+      <w:r>
+        <w:rPr>
+          <w:rStyle w:val="AttributeTok"/>
+        </w:rPr>
+        <w:t xml:space="preserve">--scope</w:t>
+      </w:r>
+      <w:r>
+        <w:rPr>
+          <w:rStyle w:val="OperatorTok"/>
+        </w:rPr>
+        <w:t xml:space="preserve">=</w:t>
+      </w:r>
+      <w:r>
+        <w:rPr>
+          <w:rStyle w:val="NormalTok"/>
+        </w:rPr>
+        <w:t xml:space="preserve">fonds </w:t>
+      </w:r>
+      <w:r>
+        <w:rPr>
+          <w:rStyle w:val="AttributeTok"/>
+        </w:rPr>
+        <w:t xml:space="preserve">--slug</w:t>
+      </w:r>
+      <w:r>
+        <w:rPr>
+          <w:rStyle w:val="OperatorTok"/>
+        </w:rPr>
+        <w:t xml:space="preserve">=</w:t>
+      </w:r>
+      <w:r>
+        <w:rPr>
+          <w:rStyle w:val="NormalTok"/>
+        </w:rPr>
+        <w:t xml:space="preserve">my-fonds </w:t>
+      </w:r>
+      <w:r>
+        <w:rPr>
+          <w:rStyle w:val="AttributeTok"/>
+        </w:rPr>
+        <w:t xml:space="preserve">--mode</w:t>
+      </w:r>
+      <w:r>
+        <w:rPr>
+          <w:rStyle w:val="OperatorTok"/>
+        </w:rPr>
+        <w:t xml:space="preserve">=</w:t>
+      </w:r>
+      <w:r>
+        <w:rPr>
+          <w:rStyle w:val="NormalTok"/>
+        </w:rPr>
+        <w:t xml:space="preserve">read_only</w:t>
+      </w:r>
+      <w:r>
+        <w:br/>
+      </w:r>
+      <w:r>
+        <w:br/>
+      </w:r>
+      <w:r>
+        <w:rPr>
+          <w:rStyle w:val="CommentTok"/>
+        </w:rPr>
+        <w:t xml:space="preserve"># Import (dry run)</w:t>
+      </w:r>
+      <w:r>
+        <w:br/>
+      </w:r>
+      <w:r>
+        <w:rPr>
+          <w:rStyle w:val="ExtensionTok"/>
+        </w:rPr>
+        <w:t xml:space="preserve">php</w:t>
+      </w:r>
+      <w:r>
+        <w:rPr>
+          <w:rStyle w:val="NormalTok"/>
+        </w:rPr>
+        <w:t xml:space="preserve"> symfony portable:import </w:t>
+      </w:r>
+      <w:r>
+        <w:rPr>
+          <w:rStyle w:val="AttributeTok"/>
+        </w:rPr>
+        <w:t xml:space="preserve">--zip</w:t>
+      </w:r>
+      <w:r>
+        <w:rPr>
+          <w:rStyle w:val="OperatorTok"/>
+        </w:rPr>
+        <w:t xml:space="preserve">=</w:t>
+      </w:r>
+      <w:r>
+        <w:rPr>
+          <w:rStyle w:val="NormalTok"/>
+        </w:rPr>
+        <w:t xml:space="preserve">/path/to/archive.zip </w:t>
+      </w:r>
+      <w:r>
+        <w:rPr>
+          <w:rStyle w:val="AttributeTok"/>
+        </w:rPr>
+        <w:t xml:space="preserve">--mode</w:t>
+      </w:r>
+      <w:r>
+        <w:rPr>
+          <w:rStyle w:val="OperatorTok"/>
+        </w:rPr>
+        <w:t xml:space="preserve">=</w:t>
+      </w:r>
+      <w:r>
+        <w:rPr>
+          <w:rStyle w:val="NormalTok"/>
+        </w:rPr>
+        <w:t xml:space="preserve">dry_run</w:t>
+      </w:r>
+      <w:r>
+        <w:br/>
+      </w:r>
+      <w:r>
+        <w:br/>
+      </w:r>
+      <w:r>
+        <w:rPr>
+          <w:rStyle w:val="CommentTok"/>
+        </w:rPr>
+        <w:t xml:space="preserve"># Import (merge — skip existing, import new)</w:t>
+      </w:r>
+      <w:r>
+        <w:br/>
+      </w:r>
+      <w:r>
+        <w:rPr>
+          <w:rStyle w:val="ExtensionTok"/>
+        </w:rPr>
+        <w:t xml:space="preserve">php</w:t>
+      </w:r>
+      <w:r>
+        <w:rPr>
+          <w:rStyle w:val="NormalTok"/>
+        </w:rPr>
+        <w:t xml:space="preserve"> symfony portable:import </w:t>
+      </w:r>
+      <w:r>
+        <w:rPr>
+          <w:rStyle w:val="AttributeTok"/>
+        </w:rPr>
+        <w:t xml:space="preserve">--zip</w:t>
+      </w:r>
+      <w:r>
+        <w:rPr>
+          <w:rStyle w:val="OperatorTok"/>
+        </w:rPr>
+        <w:t xml:space="preserve">=</w:t>
+      </w:r>
+      <w:r>
+        <w:rPr>
+          <w:rStyle w:val="NormalTok"/>
+        </w:rPr>
+        <w:t xml:space="preserve">/path/to/archive.zip </w:t>
+      </w:r>
+      <w:r>
+        <w:rPr>
+          <w:rStyle w:val="AttributeTok"/>
+        </w:rPr>
+        <w:t xml:space="preserve">--mode</w:t>
+      </w:r>
+      <w:r>
+        <w:rPr>
+          <w:rStyle w:val="OperatorTok"/>
+        </w:rPr>
+        <w:t xml:space="preserve">=</w:t>
+      </w:r>
+      <w:r>
+        <w:rPr>
+          <w:rStyle w:val="NormalTok"/>
+        </w:rPr>
+        <w:t xml:space="preserve">merge</w:t>
+      </w:r>
+      <w:r>
+        <w:br/>
+      </w:r>
+      <w:r>
+        <w:br/>
+      </w:r>
+      <w:r>
+        <w:rPr>
+          <w:rStyle w:val="CommentTok"/>
+        </w:rPr>
+        <w:t xml:space="preserve"># Import specific entity types</w:t>
+      </w:r>
+      <w:r>
+        <w:br/>
+      </w:r>
+      <w:r>
+        <w:rPr>
+          <w:rStyle w:val="ExtensionTok"/>
+        </w:rPr>
+        <w:t xml:space="preserve">php</w:t>
+      </w:r>
+      <w:r>
+        <w:rPr>
+          <w:rStyle w:val="NormalTok"/>
+        </w:rPr>
+        <w:t xml:space="preserve"> symfony portable:import </w:t>
+      </w:r>
+      <w:r>
+        <w:rPr>
+          <w:rStyle w:val="AttributeTok"/>
+        </w:rPr>
+        <w:t xml:space="preserve">--zip</w:t>
+      </w:r>
+      <w:r>
+        <w:rPr>
+          <w:rStyle w:val="OperatorTok"/>
+        </w:rPr>
+        <w:t xml:space="preserve">=</w:t>
+      </w:r>
+      <w:r>
+        <w:rPr>
+          <w:rStyle w:val="NormalTok"/>
+        </w:rPr>
+        <w:t xml:space="preserve">/path/to/archive.zip </w:t>
+      </w:r>
+      <w:r>
+        <w:rPr>
+          <w:rStyle w:val="AttributeTok"/>
+        </w:rPr>
+        <w:t xml:space="preserve">--entity-types</w:t>
+      </w:r>
+      <w:r>
+        <w:rPr>
+          <w:rStyle w:val="OperatorTok"/>
+        </w:rPr>
+        <w:t xml:space="preserve">=</w:t>
+      </w:r>
+      <w:r>
+        <w:rPr>
+          <w:rStyle w:val="NormalTok"/>
+        </w:rPr>
+        <w:t xml:space="preserve">descriptions,authorities,taxonomies</w:t>
+      </w:r>
+      <w:r>
+        <w:br/>
+      </w:r>
+      <w:r>
+        <w:br/>
+      </w:r>
+      <w:r>
+        <w:rPr>
+          <w:rStyle w:val="CommentTok"/>
+        </w:rPr>
+        <w:t xml:space="preserve"># Verify an archive export</w:t>
+      </w:r>
+      <w:r>
+        <w:br/>
+      </w:r>
+      <w:r>
+        <w:rPr>
+          <w:rStyle w:val="ExtensionTok"/>
+        </w:rPr>
+        <w:t xml:space="preserve">php</w:t>
+      </w:r>
+      <w:r>
+        <w:rPr>
+          <w:rStyle w:val="NormalTok"/>
+        </w:rPr>
+        <w:t xml:space="preserve"> symfony portable:verify </w:t>
+      </w:r>
+      <w:r>
+        <w:rPr>
+          <w:rStyle w:val="AttributeTok"/>
+        </w:rPr>
+        <w:t xml:space="preserve">--path</w:t>
+      </w:r>
+      <w:r>
+        <w:rPr>
+          <w:rStyle w:val="OperatorTok"/>
+        </w:rPr>
+        <w:t xml:space="preserve">=</w:t>
+      </w:r>
+      <w:r>
+        <w:rPr>
+          <w:rStyle w:val="NormalTok"/>
+        </w:rPr>
+        <w:t xml:space="preserve">/path/to/export.zip</w:t>
+      </w:r>
+      <w:r>
+        <w:br/>
+      </w:r>
+      <w:r>
+        <w:br/>
+      </w:r>
+      <w:r>
+        <w:rPr>
+          <w:rStyle w:val="CommentTok"/>
+        </w:rPr>
+        <w:t xml:space="preserve"># Clean up expired exports</w:t>
+      </w:r>
+      <w:r>
+        <w:br/>
+      </w:r>
+      <w:r>
+        <w:rPr>
+          <w:rStyle w:val="ExtensionTok"/>
+        </w:rPr>
+        <w:t xml:space="preserve">php</w:t>
+      </w:r>
+      <w:r>
+        <w:rPr>
+          <w:rStyle w:val="NormalTok"/>
+        </w:rPr>
+        <w:t xml:space="preserve"> symfony portable:cleanup</w:t>
       </w:r>
     </w:p>
     <w:p>
@@ -1228,6 +1111,884 @@
         </w:pict>
       </w:r>
     </w:p>
+    <w:bookmarkEnd w:id="27"/>
+    <w:bookmarkStart w:id="28" w:name="archive-export-package-structure"/>
+    <w:p>
+      <w:pPr>
+        <w:pStyle w:val="Heading2"/>
+      </w:pPr>
+      <w:r>
+        <w:t xml:space="preserve">Archive Export Package Structure</w:t>
+      </w:r>
+    </w:p>
+    <w:p>
+      <w:pPr>
+        <w:pStyle w:val="SourceCode"/>
+      </w:pPr>
+      <w:r>
+        <w:rPr>
+          <w:rStyle w:val="VerbatimChar"/>
+        </w:rPr>
+        <w:t xml:space="preserve">export-{id}/</w:t>
+      </w:r>
+      <w:r>
+        <w:br/>
+      </w:r>
+      <w:r>
+        <w:rPr>
+          <w:rStyle w:val="VerbatimChar"/>
+        </w:rPr>
+        <w:t xml:space="preserve">  manifest.json              # Checksums, entity counts, schema, export metadata</w:t>
+      </w:r>
+      <w:r>
+        <w:br/>
+      </w:r>
+      <w:r>
+        <w:rPr>
+          <w:rStyle w:val="VerbatimChar"/>
+        </w:rPr>
+        <w:t xml:space="preserve">  README.md                  # Package overview + re-import instructions</w:t>
+      </w:r>
+      <w:r>
+        <w:br/>
+      </w:r>
+      <w:r>
+        <w:rPr>
+          <w:rStyle w:val="VerbatimChar"/>
+        </w:rPr>
+        <w:t xml:space="preserve">  data/</w:t>
+      </w:r>
+      <w:r>
+        <w:br/>
+      </w:r>
+      <w:r>
+        <w:rPr>
+          <w:rStyle w:val="VerbatimChar"/>
+        </w:rPr>
+        <w:t xml:space="preserve">    descriptions.json        # ISAD(G) fields + all i18n + properties</w:t>
+      </w:r>
+      <w:r>
+        <w:br/>
+      </w:r>
+      <w:r>
+        <w:rPr>
+          <w:rStyle w:val="VerbatimChar"/>
+        </w:rPr>
+        <w:t xml:space="preserve">    authorities.json         # Actors with type, dates, relations</w:t>
+      </w:r>
+      <w:r>
+        <w:br/>
+      </w:r>
+      <w:r>
+        <w:rPr>
+          <w:rStyle w:val="VerbatimChar"/>
+        </w:rPr>
+        <w:t xml:space="preserve">    taxonomies.json          # Full taxonomy trees with parent-child</w:t>
+      </w:r>
+      <w:r>
+        <w:br/>
+      </w:r>
+      <w:r>
+        <w:rPr>
+          <w:rStyle w:val="VerbatimChar"/>
+        </w:rPr>
+        <w:t xml:space="preserve">    rights.json              # Rights statements linked to objects</w:t>
+      </w:r>
+      <w:r>
+        <w:br/>
+      </w:r>
+      <w:r>
+        <w:rPr>
+          <w:rStyle w:val="VerbatimChar"/>
+        </w:rPr>
+        <w:t xml:space="preserve">    accessions.json          # Accession records + events + donors</w:t>
+      </w:r>
+      <w:r>
+        <w:br/>
+      </w:r>
+      <w:r>
+        <w:rPr>
+          <w:rStyle w:val="VerbatimChar"/>
+        </w:rPr>
+        <w:t xml:space="preserve">    physical_objects.json    # Storage locations</w:t>
+      </w:r>
+      <w:r>
+        <w:br/>
+      </w:r>
+      <w:r>
+        <w:rPr>
+          <w:rStyle w:val="VerbatimChar"/>
+        </w:rPr>
+        <w:t xml:space="preserve">    events.json              # Events linked to descriptions</w:t>
+      </w:r>
+      <w:r>
+        <w:br/>
+      </w:r>
+      <w:r>
+        <w:rPr>
+          <w:rStyle w:val="VerbatimChar"/>
+        </w:rPr>
+        <w:t xml:space="preserve">    notes.json               # Notes by type</w:t>
+      </w:r>
+      <w:r>
+        <w:br/>
+      </w:r>
+      <w:r>
+        <w:rPr>
+          <w:rStyle w:val="VerbatimChar"/>
+        </w:rPr>
+        <w:t xml:space="preserve">    relations.json           # Inter-entity relationships</w:t>
+      </w:r>
+      <w:r>
+        <w:br/>
+      </w:r>
+      <w:r>
+        <w:rPr>
+          <w:rStyle w:val="VerbatimChar"/>
+        </w:rPr>
+        <w:t xml:space="preserve">    digital_objects.json     # Digital object metadata</w:t>
+      </w:r>
+      <w:r>
+        <w:br/>
+      </w:r>
+      <w:r>
+        <w:rPr>
+          <w:rStyle w:val="VerbatimChar"/>
+        </w:rPr>
+        <w:t xml:space="preserve">    repositories.json        # Repository metadata + contacts</w:t>
+      </w:r>
+      <w:r>
+        <w:br/>
+      </w:r>
+      <w:r>
+        <w:rPr>
+          <w:rStyle w:val="VerbatimChar"/>
+        </w:rPr>
+        <w:t xml:space="preserve">    object_term_relations.json # Subject/place/genre access points</w:t>
+      </w:r>
+      <w:r>
+        <w:br/>
+      </w:r>
+      <w:r>
+        <w:rPr>
+          <w:rStyle w:val="VerbatimChar"/>
+        </w:rPr>
+        <w:t xml:space="preserve">    settings.json            # System + plugin settings</w:t>
+      </w:r>
+      <w:r>
+        <w:br/>
+      </w:r>
+      <w:r>
+        <w:rPr>
+          <w:rStyle w:val="VerbatimChar"/>
+        </w:rPr>
+        <w:t xml:space="preserve">    users.json               # Users, ACL groups, permissions</w:t>
+      </w:r>
+      <w:r>
+        <w:br/>
+      </w:r>
+      <w:r>
+        <w:rPr>
+          <w:rStyle w:val="VerbatimChar"/>
+        </w:rPr>
+        <w:t xml:space="preserve">    menus.json               # Navigation structure (MPTT)</w:t>
+      </w:r>
+      <w:r>
+        <w:br/>
+      </w:r>
+      <w:r>
+        <w:rPr>
+          <w:rStyle w:val="VerbatimChar"/>
+        </w:rPr>
+        <w:t xml:space="preserve">  objects/                   # Digital object files (if included)</w:t>
+      </w:r>
+    </w:p>
+    <w:p>
+      <w:r>
+        <w:pict>
+          <v:rect style="width:0;height:1.5pt" o:hralign="center" o:hrstd="t" o:hr="t"/>
+        </w:pict>
+      </w:r>
+    </w:p>
+    <w:bookmarkEnd w:id="28"/>
+    <w:bookmarkStart w:id="29" w:name="technical-requirements"/>
+    <w:p>
+      <w:pPr>
+        <w:pStyle w:val="Heading2"/>
+      </w:pPr>
+      <w:r>
+        <w:t xml:space="preserve">Technical Requirements</w:t>
+      </w:r>
+    </w:p>
+    <w:p>
+      <w:pPr>
+        <w:numPr>
+          <w:ilvl w:val="0"/>
+          <w:numId w:val="1007"/>
+        </w:numPr>
+        <w:pStyle w:val="Compact"/>
+      </w:pPr>
+      <w:r>
+        <w:t xml:space="preserve">AtoM Heratio Framework v2.0+</w:t>
+      </w:r>
+    </w:p>
+    <w:p>
+      <w:pPr>
+        <w:numPr>
+          <w:ilvl w:val="0"/>
+          <w:numId w:val="1007"/>
+        </w:numPr>
+        <w:pStyle w:val="Compact"/>
+      </w:pPr>
+      <w:r>
+        <w:t xml:space="preserve">PHP 8.1+</w:t>
+      </w:r>
+    </w:p>
+    <w:p>
+      <w:pPr>
+        <w:numPr>
+          <w:ilvl w:val="0"/>
+          <w:numId w:val="1007"/>
+        </w:numPr>
+        <w:pStyle w:val="Compact"/>
+      </w:pPr>
+      <w:r>
+        <w:t xml:space="preserve">MySQL 8.0+</w:t>
+      </w:r>
+    </w:p>
+    <w:p>
+      <w:pPr>
+        <w:numPr>
+          <w:ilvl w:val="0"/>
+          <w:numId w:val="1007"/>
+        </w:numPr>
+        <w:pStyle w:val="Compact"/>
+      </w:pPr>
+      <w:r>
+        <w:t xml:space="preserve">ahgCorePlugin (dependency)</w:t>
+      </w:r>
+    </w:p>
+    <w:p>
+      <w:r>
+        <w:pict>
+          <v:rect style="width:0;height:1.5pt" o:hralign="center" o:hrstd="t" o:hr="t"/>
+        </w:pict>
+      </w:r>
+    </w:p>
+    <w:bookmarkEnd w:id="29"/>
+    <w:bookmarkStart w:id="30" w:name="compliance-standards"/>
+    <w:p>
+      <w:pPr>
+        <w:pStyle w:val="Heading2"/>
+      </w:pPr>
+      <w:r>
+        <w:t xml:space="preserve">Compliance &amp; Standards</w:t>
+      </w:r>
+    </w:p>
+    <w:tbl>
+      <w:tblPr>
+        <w:tblStyle w:val="Table"/>
+        <w:tblW w:type="auto" w:w="0"/>
+        <w:tblLook w:firstRow="1" w:lastRow="0" w:firstColumn="0" w:lastColumn="0" w:noHBand="0" w:noVBand="0" w:val="0020"/>
+        <w:jc w:val="start"/>
+      </w:tblPr>
+      <w:tblGrid>
+        <w:gridCol w:w="3960"/>
+        <w:gridCol w:w="3960"/>
+      </w:tblGrid>
+      <w:tr>
+        <w:trPr>
+          <w:tblHeader w:val="true"/>
+        </w:trPr>
+        <w:tc>
+          <w:tcPr/>
+          <w:p>
+            <w:pPr>
+              <w:pStyle w:val="Compact"/>
+              <w:jc w:val="left"/>
+            </w:pPr>
+            <w:r>
+              <w:t xml:space="preserve">Standard</w:t>
+            </w:r>
+          </w:p>
+        </w:tc>
+        <w:tc>
+          <w:tcPr/>
+          <w:p>
+            <w:pPr>
+              <w:pStyle w:val="Compact"/>
+              <w:jc w:val="left"/>
+            </w:pPr>
+            <w:r>
+              <w:t xml:space="preserve">Coverage</w:t>
+            </w:r>
+          </w:p>
+        </w:tc>
+      </w:tr>
+      <w:tr>
+        <w:tc>
+          <w:tcPr/>
+          <w:p>
+            <w:pPr>
+              <w:pStyle w:val="Compact"/>
+              <w:jc w:val="left"/>
+            </w:pPr>
+            <w:r>
+              <w:t xml:space="preserve">OAIS (ISO 14721)</w:t>
+            </w:r>
+          </w:p>
+        </w:tc>
+        <w:tc>
+          <w:tcPr/>
+          <w:p>
+            <w:pPr>
+              <w:pStyle w:val="Compact"/>
+              <w:jc w:val="left"/>
+            </w:pPr>
+            <w:r>
+              <w:t xml:space="preserve">Archive packages align with SIP/AIP concepts</w:t>
+            </w:r>
+          </w:p>
+        </w:tc>
+      </w:tr>
+      <w:tr>
+        <w:tc>
+          <w:tcPr/>
+          <w:p>
+            <w:pPr>
+              <w:pStyle w:val="Compact"/>
+              <w:jc w:val="left"/>
+            </w:pPr>
+            <w:r>
+              <w:t xml:space="preserve">SHA-256</w:t>
+            </w:r>
+          </w:p>
+        </w:tc>
+        <w:tc>
+          <w:tcPr/>
+          <w:p>
+            <w:pPr>
+              <w:pStyle w:val="Compact"/>
+              <w:jc w:val="left"/>
+            </w:pPr>
+            <w:r>
+              <w:t xml:space="preserve">Every file checksummed in manifest for bit-level integrity</w:t>
+            </w:r>
+          </w:p>
+        </w:tc>
+      </w:tr>
+      <w:tr>
+        <w:tc>
+          <w:tcPr/>
+          <w:p>
+            <w:pPr>
+              <w:pStyle w:val="Compact"/>
+              <w:jc w:val="left"/>
+            </w:pPr>
+            <w:r>
+              <w:t xml:space="preserve">ISAD(G)</w:t>
+            </w:r>
+          </w:p>
+        </w:tc>
+        <w:tc>
+          <w:tcPr/>
+          <w:p>
+            <w:pPr>
+              <w:pStyle w:val="Compact"/>
+              <w:jc w:val="left"/>
+            </w:pPr>
+            <w:r>
+              <w:t xml:space="preserve">Full descriptive metadata preserved</w:t>
+            </w:r>
+          </w:p>
+        </w:tc>
+      </w:tr>
+      <w:tr>
+        <w:tc>
+          <w:tcPr/>
+          <w:p>
+            <w:pPr>
+              <w:pStyle w:val="Compact"/>
+              <w:jc w:val="left"/>
+            </w:pPr>
+            <w:r>
+              <w:t xml:space="preserve">ISAAR(CPF)</w:t>
+            </w:r>
+          </w:p>
+        </w:tc>
+        <w:tc>
+          <w:tcPr/>
+          <w:p>
+            <w:pPr>
+              <w:pStyle w:val="Compact"/>
+              <w:jc w:val="left"/>
+            </w:pPr>
+            <w:r>
+              <w:t xml:space="preserve">Authority records with complete fields</w:t>
+            </w:r>
+          </w:p>
+        </w:tc>
+      </w:tr>
+      <w:tr>
+        <w:tc>
+          <w:tcPr/>
+          <w:p>
+            <w:pPr>
+              <w:pStyle w:val="Compact"/>
+              <w:jc w:val="left"/>
+            </w:pPr>
+            <w:r>
+              <w:t xml:space="preserve">Data Portability</w:t>
+            </w:r>
+          </w:p>
+        </w:tc>
+        <w:tc>
+          <w:tcPr/>
+          <w:p>
+            <w:pPr>
+              <w:pStyle w:val="Compact"/>
+              <w:jc w:val="left"/>
+            </w:pPr>
+            <w:r>
+              <w:t xml:space="preserve">Full exit path — no vendor lock-in</w:t>
+            </w:r>
+          </w:p>
+        </w:tc>
+      </w:tr>
+    </w:tbl>
+    <w:p>
+      <w:r>
+        <w:pict>
+          <v:rect style="width:0;height:1.5pt" o:hralign="center" o:hrstd="t" o:hr="t"/>
+        </w:pict>
+      </w:r>
+    </w:p>
+    <w:bookmarkEnd w:id="30"/>
+    <w:bookmarkStart w:id="33" w:name="admin-ui"/>
+    <w:p>
+      <w:pPr>
+        <w:pStyle w:val="Heading2"/>
+      </w:pPr>
+      <w:r>
+        <w:t xml:space="preserve">Admin UI</w:t>
+      </w:r>
+    </w:p>
+    <w:bookmarkStart w:id="31" w:name="export-wizard"/>
+    <w:p>
+      <w:pPr>
+        <w:pStyle w:val="Heading3"/>
+      </w:pPr>
+      <w:r>
+        <w:t xml:space="preserve">Export Wizard</w:t>
+      </w:r>
+    </w:p>
+    <w:p>
+      <w:pPr>
+        <w:pStyle w:val="FirstParagraph"/>
+      </w:pPr>
+      <w:r>
+        <w:t xml:space="preserve">Access via</w:t>
+      </w:r>
+      <w:r>
+        <w:t xml:space="preserve"> </w:t>
+      </w:r>
+      <w:r>
+        <w:rPr>
+          <w:bCs/>
+          <w:b/>
+        </w:rPr>
+        <w:t xml:space="preserve">Admin &gt; Portable Export</w:t>
+      </w:r>
+      <w:r>
+        <w:t xml:space="preserve"> </w:t>
+      </w:r>
+      <w:r>
+        <w:t xml:space="preserve">(</w:t>
+      </w:r>
+      <w:r>
+        <w:rPr>
+          <w:rStyle w:val="VerbatimChar"/>
+        </w:rPr>
+        <w:t xml:space="preserve">/portable-export</w:t>
+      </w:r>
+      <w:r>
+        <w:t xml:space="preserve">).</w:t>
+      </w:r>
+    </w:p>
+    <w:p>
+      <w:pPr>
+        <w:pStyle w:val="BodyText"/>
+      </w:pPr>
+      <w:r>
+        <w:t xml:space="preserve">4-step wizard:</w:t>
+      </w:r>
+      <w:r>
+        <w:t xml:space="preserve"> </w:t>
+      </w:r>
+      <w:r>
+        <w:t xml:space="preserve">1.</w:t>
+      </w:r>
+      <w:r>
+        <w:t xml:space="preserve"> </w:t>
+      </w:r>
+      <w:r>
+        <w:rPr>
+          <w:bCs/>
+          <w:b/>
+        </w:rPr>
+        <w:t xml:space="preserve">Scope</w:t>
+      </w:r>
+      <w:r>
+        <w:t xml:space="preserve"> </w:t>
+      </w:r>
+      <w:r>
+        <w:t xml:space="preserve">— Select what to export (all, fonds, repository)</w:t>
+      </w:r>
+      <w:r>
+        <w:t xml:space="preserve"> </w:t>
+      </w:r>
+      <w:r>
+        <w:t xml:space="preserve">2.</w:t>
+      </w:r>
+      <w:r>
+        <w:t xml:space="preserve"> </w:t>
+      </w:r>
+      <w:r>
+        <w:rPr>
+          <w:bCs/>
+          <w:b/>
+        </w:rPr>
+        <w:t xml:space="preserve">Content</w:t>
+      </w:r>
+      <w:r>
+        <w:t xml:space="preserve"> </w:t>
+      </w:r>
+      <w:r>
+        <w:t xml:space="preserve">— Choose export type (Viewer/Archive), entity types, digital objects</w:t>
+      </w:r>
+      <w:r>
+        <w:t xml:space="preserve"> </w:t>
+      </w:r>
+      <w:r>
+        <w:t xml:space="preserve">3.</w:t>
+      </w:r>
+      <w:r>
+        <w:t xml:space="preserve"> </w:t>
+      </w:r>
+      <w:r>
+        <w:rPr>
+          <w:bCs/>
+          <w:b/>
+        </w:rPr>
+        <w:t xml:space="preserve">Configure</w:t>
+      </w:r>
+      <w:r>
+        <w:t xml:space="preserve"> </w:t>
+      </w:r>
+      <w:r>
+        <w:t xml:space="preserve">— Title, language, branding</w:t>
+      </w:r>
+      <w:r>
+        <w:t xml:space="preserve"> </w:t>
+      </w:r>
+      <w:r>
+        <w:t xml:space="preserve">4.</w:t>
+      </w:r>
+      <w:r>
+        <w:t xml:space="preserve"> </w:t>
+      </w:r>
+      <w:r>
+        <w:rPr>
+          <w:bCs/>
+          <w:b/>
+        </w:rPr>
+        <w:t xml:space="preserve">Generate</w:t>
+      </w:r>
+      <w:r>
+        <w:t xml:space="preserve"> </w:t>
+      </w:r>
+      <w:r>
+        <w:t xml:space="preserve">— Review settings, start export, monitor progress</w:t>
+      </w:r>
+    </w:p>
+    <w:bookmarkEnd w:id="31"/>
+    <w:bookmarkStart w:id="32" w:name="import-wizard"/>
+    <w:p>
+      <w:pPr>
+        <w:pStyle w:val="Heading3"/>
+      </w:pPr>
+      <w:r>
+        <w:t xml:space="preserve">Import Wizard</w:t>
+      </w:r>
+    </w:p>
+    <w:p>
+      <w:pPr>
+        <w:pStyle w:val="FirstParagraph"/>
+      </w:pPr>
+      <w:r>
+        <w:t xml:space="preserve">Access via</w:t>
+      </w:r>
+      <w:r>
+        <w:t xml:space="preserve"> </w:t>
+      </w:r>
+      <w:r>
+        <w:rPr>
+          <w:rStyle w:val="VerbatimChar"/>
+        </w:rPr>
+        <w:t xml:space="preserve">/portable-export/import</w:t>
+      </w:r>
+      <w:r>
+        <w:t xml:space="preserve"> </w:t>
+      </w:r>
+      <w:r>
+        <w:t xml:space="preserve">(or click</w:t>
+      </w:r>
+      <w:r>
+        <w:t xml:space="preserve"> </w:t>
+      </w:r>
+      <w:r>
+        <w:t xml:space="preserve">“</w:t>
+      </w:r>
+      <w:r>
+        <w:t xml:space="preserve">Import Archive</w:t>
+      </w:r>
+      <w:r>
+        <w:t xml:space="preserve">”</w:t>
+      </w:r>
+      <w:r>
+        <w:t xml:space="preserve"> </w:t>
+      </w:r>
+      <w:r>
+        <w:t xml:space="preserve">on the export page).</w:t>
+      </w:r>
+    </w:p>
+    <w:p>
+      <w:pPr>
+        <w:pStyle w:val="BodyText"/>
+      </w:pPr>
+      <w:r>
+        <w:t xml:space="preserve">3-step wizard:</w:t>
+      </w:r>
+      <w:r>
+        <w:t xml:space="preserve"> </w:t>
+      </w:r>
+      <w:r>
+        <w:t xml:space="preserve">1.</w:t>
+      </w:r>
+      <w:r>
+        <w:t xml:space="preserve"> </w:t>
+      </w:r>
+      <w:r>
+        <w:rPr>
+          <w:bCs/>
+          <w:b/>
+        </w:rPr>
+        <w:t xml:space="preserve">Upload</w:t>
+      </w:r>
+      <w:r>
+        <w:t xml:space="preserve"> </w:t>
+      </w:r>
+      <w:r>
+        <w:t xml:space="preserve">— Upload ZIP or enter server path, validate archive</w:t>
+      </w:r>
+      <w:r>
+        <w:t xml:space="preserve"> </w:t>
+      </w:r>
+      <w:r>
+        <w:t xml:space="preserve">2.</w:t>
+      </w:r>
+      <w:r>
+        <w:t xml:space="preserve"> </w:t>
+      </w:r>
+      <w:r>
+        <w:rPr>
+          <w:bCs/>
+          <w:b/>
+        </w:rPr>
+        <w:t xml:space="preserve">Configure</w:t>
+      </w:r>
+      <w:r>
+        <w:t xml:space="preserve"> </w:t>
+      </w:r>
+      <w:r>
+        <w:t xml:space="preserve">— Select mode (merge/dry-run/replace), choose entity types</w:t>
+      </w:r>
+      <w:r>
+        <w:t xml:space="preserve"> </w:t>
+      </w:r>
+      <w:r>
+        <w:t xml:space="preserve">3.</w:t>
+      </w:r>
+      <w:r>
+        <w:t xml:space="preserve"> </w:t>
+      </w:r>
+      <w:r>
+        <w:rPr>
+          <w:bCs/>
+          <w:b/>
+        </w:rPr>
+        <w:t xml:space="preserve">Import</w:t>
+      </w:r>
+      <w:r>
+        <w:t xml:space="preserve"> </w:t>
+      </w:r>
+      <w:r>
+        <w:t xml:space="preserve">— Real-time progress with imported/skipped/error counters</w:t>
+      </w:r>
+    </w:p>
+    <w:p>
+      <w:r>
+        <w:pict>
+          <v:rect style="width:0;height:1.5pt" o:hralign="center" o:hrstd="t" o:hr="t"/>
+        </w:pict>
+      </w:r>
+    </w:p>
+    <w:bookmarkEnd w:id="32"/>
+    <w:bookmarkEnd w:id="33"/>
+    <w:bookmarkStart w:id="34" w:name="database-tables"/>
+    <w:p>
+      <w:pPr>
+        <w:pStyle w:val="Heading2"/>
+      </w:pPr>
+      <w:r>
+        <w:t xml:space="preserve">Database Tables</w:t>
+      </w:r>
+    </w:p>
+    <w:tbl>
+      <w:tblPr>
+        <w:tblStyle w:val="Table"/>
+        <w:tblW w:type="auto" w:w="0"/>
+        <w:tblLook w:firstRow="1" w:lastRow="0" w:firstColumn="0" w:lastColumn="0" w:noHBand="0" w:noVBand="0" w:val="0020"/>
+        <w:jc w:val="start"/>
+      </w:tblPr>
+      <w:tblGrid>
+        <w:gridCol w:w="3960"/>
+        <w:gridCol w:w="3960"/>
+      </w:tblGrid>
+      <w:tr>
+        <w:trPr>
+          <w:tblHeader w:val="true"/>
+        </w:trPr>
+        <w:tc>
+          <w:tcPr/>
+          <w:p>
+            <w:pPr>
+              <w:pStyle w:val="Compact"/>
+              <w:jc w:val="left"/>
+            </w:pPr>
+            <w:r>
+              <w:t xml:space="preserve">Table</w:t>
+            </w:r>
+          </w:p>
+        </w:tc>
+        <w:tc>
+          <w:tcPr/>
+          <w:p>
+            <w:pPr>
+              <w:pStyle w:val="Compact"/>
+              <w:jc w:val="left"/>
+            </w:pPr>
+            <w:r>
+              <w:t xml:space="preserve">Purpose</w:t>
+            </w:r>
+          </w:p>
+        </w:tc>
+      </w:tr>
+      <w:tr>
+        <w:tc>
+          <w:tcPr/>
+          <w:p>
+            <w:pPr>
+              <w:pStyle w:val="Compact"/>
+              <w:jc w:val="left"/>
+            </w:pPr>
+            <w:r>
+              <w:rPr>
+                <w:rStyle w:val="VerbatimChar"/>
+              </w:rPr>
+              <w:t xml:space="preserve">portable_export</w:t>
+            </w:r>
+          </w:p>
+        </w:tc>
+        <w:tc>
+          <w:tcPr/>
+          <w:p>
+            <w:pPr>
+              <w:pStyle w:val="Compact"/>
+              <w:jc w:val="left"/>
+            </w:pPr>
+            <w:r>
+              <w:t xml:space="preserve">Export job tracking</w:t>
+            </w:r>
+          </w:p>
+        </w:tc>
+      </w:tr>
+      <w:tr>
+        <w:tc>
+          <w:tcPr/>
+          <w:p>
+            <w:pPr>
+              <w:pStyle w:val="Compact"/>
+              <w:jc w:val="left"/>
+            </w:pPr>
+            <w:r>
+              <w:rPr>
+                <w:rStyle w:val="VerbatimChar"/>
+              </w:rPr>
+              <w:t xml:space="preserve">portable_export_token</w:t>
+            </w:r>
+          </w:p>
+        </w:tc>
+        <w:tc>
+          <w:tcPr/>
+          <w:p>
+            <w:pPr>
+              <w:pStyle w:val="Compact"/>
+              <w:jc w:val="left"/>
+            </w:pPr>
+            <w:r>
+              <w:t xml:space="preserve">Secure download tokens</w:t>
+            </w:r>
+          </w:p>
+        </w:tc>
+      </w:tr>
+      <w:tr>
+        <w:tc>
+          <w:tcPr/>
+          <w:p>
+            <w:pPr>
+              <w:pStyle w:val="Compact"/>
+              <w:jc w:val="left"/>
+            </w:pPr>
+            <w:r>
+              <w:rPr>
+                <w:rStyle w:val="VerbatimChar"/>
+              </w:rPr>
+              <w:t xml:space="preserve">portable_import</w:t>
+            </w:r>
+          </w:p>
+        </w:tc>
+        <w:tc>
+          <w:tcPr/>
+          <w:p>
+            <w:pPr>
+              <w:pStyle w:val="Compact"/>
+              <w:jc w:val="left"/>
+            </w:pPr>
+            <w:r>
+              <w:t xml:space="preserve">Import job tracking with ID mapping</w:t>
+            </w:r>
+          </w:p>
+        </w:tc>
+      </w:tr>
+    </w:tbl>
+    <w:p>
+      <w:r>
+        <w:pict>
+          <v:rect style="width:0;height:1.5pt" o:hralign="center" o:hrstd="t" o:hr="t"/>
+        </w:pict>
+      </w:r>
+    </w:p>
     <w:p>
       <w:pPr>
         <w:pStyle w:val="FirstParagraph"/>
@@ -1247,11 +2008,11 @@
           <w:iCs/>
           <w:i/>
         </w:rPr>
-        <w:t xml:space="preserve">https://theahg.co.za</w:t>
-      </w:r>
-    </w:p>
-    <w:bookmarkEnd w:id="29"/>
-    <w:bookmarkEnd w:id="30"/>
+        <w:t xml:space="preserve">https://www.theahg.co.za</w:t>
+      </w:r>
+    </w:p>
+    <w:bookmarkEnd w:id="34"/>
+    <w:bookmarkEnd w:id="35"/>
     <w:sectPr/>
   </w:body>
 </w:document>
@@ -1565,6 +2326,9 @@
     <w:abstractNumId w:val="991"/>
   </w:num>
   <w:num w:numId="1006">
+    <w:abstractNumId w:val="991"/>
+  </w:num>
+  <w:num w:numId="1007">
     <w:abstractNumId w:val="991"/>
   </w:num>
 </w:numbering>

</xml_diff>

<commit_message>
v3.79.52: Portable export docs: destinations (ZIP/This computer/server folder), confidentiality gate + per-user ACL scoping
</commit_message>
<xml_diff>
--- a/ahgPortableExportPlugin/docs/AtoM_Heratio_PortableExport_Feature_Overview.docx
+++ b/ahgPortableExportPlugin/docs/AtoM_Heratio_PortableExport_Feature_Overview.docx
@@ -18,7 +18,7 @@
         <w:t xml:space="preserve">The Archive and Heritage Group (Pty) Ltd</w:t>
       </w:r>
     </w:p>
-    <w:bookmarkStart w:id="35" w:name="atom-heratio-portable-export-import"/>
+    <w:bookmarkStart w:id="37" w:name="atom-heratio-portable-export-import"/>
     <w:p>
       <w:pPr>
         <w:pStyle w:val="Heading1"/>
@@ -193,7 +193,7 @@
       </w:r>
     </w:p>
     <w:bookmarkEnd w:id="21"/>
-    <w:bookmarkStart w:id="26" w:name="key-features"/>
+    <w:bookmarkStart w:id="28" w:name="key-features"/>
     <w:p>
       <w:pPr>
         <w:pStyle w:val="Heading2"/>
@@ -556,13 +556,13 @@
       </w:r>
     </w:p>
     <w:bookmarkEnd w:id="24"/>
-    <w:bookmarkStart w:id="25" w:name="shared-features"/>
+    <w:bookmarkStart w:id="25" w:name="flexible-destinations"/>
     <w:p>
       <w:pPr>
         <w:pStyle w:val="Heading3"/>
       </w:pPr>
       <w:r>
-        <w:t xml:space="preserve">Shared Features</w:t>
+        <w:t xml:space="preserve">Flexible Destinations</w:t>
       </w:r>
     </w:p>
     <w:p>
@@ -574,7 +574,17 @@
         <w:pStyle w:val="Compact"/>
       </w:pPr>
       <w:r>
-        <w:t xml:space="preserve">Export scopes: entire catalogue, specific fonds, by repository, custom (clipboard)</w:t>
+        <w:rPr>
+          <w:bCs/>
+          <w:b/>
+        </w:rPr>
+        <w:t xml:space="preserve">ZIP file</w:t>
+      </w:r>
+      <w:r>
+        <w:t xml:space="preserve"> </w:t>
+      </w:r>
+      <w:r>
+        <w:t xml:space="preserve">— a downloadable archive (the default)</w:t>
       </w:r>
     </w:p>
     <w:p>
@@ -586,7 +596,45 @@
         <w:pStyle w:val="Compact"/>
       </w:pPr>
       <w:r>
-        <w:t xml:space="preserve">Background processing with progress tracking (via QueueService or nohup fallback)</w:t>
+        <w:rPr>
+          <w:bCs/>
+          <w:b/>
+        </w:rPr>
+        <w:t xml:space="preserve">This computer</w:t>
+      </w:r>
+      <w:r>
+        <w:t xml:space="preserve"> </w:t>
+      </w:r>
+      <w:r>
+        <w:t xml:space="preserve">— writes the</w:t>
+      </w:r>
+      <w:r>
+        <w:t xml:space="preserve"> </w:t>
+      </w:r>
+      <w:r>
+        <w:rPr>
+          <w:bCs/>
+          <w:b/>
+        </w:rPr>
+        <w:t xml:space="preserve">unzipped</w:t>
+      </w:r>
+      <w:r>
+        <w:t xml:space="preserve"> </w:t>
+      </w:r>
+      <w:r>
+        <w:t xml:space="preserve">catalogue straight into a folder/drive the operator picks on their own PC/laptop/USB via the browser File System Access API, so it runs directly off the drive (double-click</w:t>
+      </w:r>
+      <w:r>
+        <w:t xml:space="preserve"> </w:t>
+      </w:r>
+      <w:r>
+        <w:rPr>
+          <w:rStyle w:val="VerbatimChar"/>
+        </w:rPr>
+        <w:t xml:space="preserve">index.html</w:t>
+      </w:r>
+      <w:r>
+        <w:t xml:space="preserve">); automatically falls back to a ZIP download on non-Chromium browsers</w:t>
       </w:r>
     </w:p>
     <w:p>
@@ -598,14 +646,195 @@
         <w:pStyle w:val="Compact"/>
       </w:pPr>
       <w:r>
-        <w:t xml:space="preserve">Admin UI: 4-step export wizard + 3-step import wizard</w:t>
+        <w:rPr>
+          <w:bCs/>
+          <w:b/>
+        </w:rPr>
+        <w:t xml:space="preserve">Server folder / drive</w:t>
+      </w:r>
+      <w:r>
+        <w:t xml:space="preserve"> </w:t>
+      </w:r>
+      <w:r>
+        <w:t xml:space="preserve">— writes the uncompressed bundle straight to a directory / mounted drive on the server (no ZIP, no size cap) for very large collections</w:t>
+      </w:r>
+    </w:p>
+    <w:bookmarkEnd w:id="25"/>
+    <w:bookmarkStart w:id="26" w:name="confidentiality-access-control"/>
+    <w:p>
+      <w:pPr>
+        <w:pStyle w:val="Heading3"/>
+      </w:pPr>
+      <w:r>
+        <w:t xml:space="preserve">Confidentiality &amp; Access Control</w:t>
       </w:r>
     </w:p>
     <w:p>
       <w:pPr>
         <w:numPr>
           <w:ilvl w:val="0"/>
-          <w:numId w:val="1006"/>
+          <w:numId w:val="1007"/>
+        </w:numPr>
+        <w:pStyle w:val="Compact"/>
+      </w:pPr>
+      <w:r>
+        <w:rPr>
+          <w:bCs/>
+          <w:b/>
+        </w:rPr>
+        <w:t xml:space="preserve">Confidentiality gate (global)</w:t>
+      </w:r>
+      <w:r>
+        <w:t xml:space="preserve"> </w:t>
+      </w:r>
+      <w:r>
+        <w:t xml:space="preserve">— automatically withholds unpublished descriptions (unless explicitly allowed), ICIP/TK culturally-restricted records (including descendant sub-trees), ODRL use-prohibited records, and PII-redacted objects</w:t>
+      </w:r>
+    </w:p>
+    <w:p>
+      <w:pPr>
+        <w:numPr>
+          <w:ilvl w:val="0"/>
+          <w:numId w:val="1007"/>
+        </w:numPr>
+        <w:pStyle w:val="Compact"/>
+      </w:pPr>
+      <w:r>
+        <w:rPr>
+          <w:bCs/>
+          <w:b/>
+        </w:rPr>
+        <w:t xml:space="preserve">Role/security scoping (per-user)</w:t>
+      </w:r>
+      <w:r>
+        <w:t xml:space="preserve"> </w:t>
+      </w:r>
+      <w:r>
+        <w:t xml:space="preserve">— a package contains only what the exporting user has view rights to; records above their security clearance, donor-closed, or under a full embargo are withheld (their embargo exceptions honoured; administrators unrestricted);</w:t>
+      </w:r>
+      <w:r>
+        <w:t xml:space="preserve"> </w:t>
+      </w:r>
+      <w:r>
+        <w:rPr>
+          <w:bCs/>
+          <w:b/>
+        </w:rPr>
+        <w:t xml:space="preserve">fails closed</w:t>
+      </w:r>
+      <w:r>
+        <w:t xml:space="preserve"> </w:t>
+      </w:r>
+      <w:r>
+        <w:t xml:space="preserve">on any access-check error</w:t>
+      </w:r>
+    </w:p>
+    <w:p>
+      <w:pPr>
+        <w:numPr>
+          <w:ilvl w:val="0"/>
+          <w:numId w:val="1007"/>
+        </w:numPr>
+        <w:pStyle w:val="Compact"/>
+      </w:pPr>
+      <w:r>
+        <w:rPr>
+          <w:bCs/>
+          <w:b/>
+        </w:rPr>
+        <w:t xml:space="preserve">Disclosure transparency</w:t>
+      </w:r>
+      <w:r>
+        <w:t xml:space="preserve"> </w:t>
+      </w:r>
+      <w:r>
+        <w:t xml:space="preserve">— every package embeds a</w:t>
+      </w:r>
+      <w:r>
+        <w:t xml:space="preserve"> </w:t>
+      </w:r>
+      <w:r>
+        <w:rPr>
+          <w:rStyle w:val="VerbatimChar"/>
+        </w:rPr>
+        <w:t xml:space="preserve">data/disclosure-summary.json</w:t>
+      </w:r>
+      <w:r>
+        <w:t xml:space="preserve"> </w:t>
+      </w:r>
+      <w:r>
+        <w:t xml:space="preserve">(per-category counts, exporting user, total withheld); the admin list shows a shield</w:t>
+      </w:r>
+      <w:r>
+        <w:t xml:space="preserve"> </w:t>
+      </w:r>
+      <w:r>
+        <w:t xml:space="preserve">“</w:t>
+      </w:r>
+      <w:r>
+        <w:t xml:space="preserve">N withheld</w:t>
+      </w:r>
+      <w:r>
+        <w:t xml:space="preserve">”</w:t>
+      </w:r>
+      <w:r>
+        <w:t xml:space="preserve"> </w:t>
+      </w:r>
+      <w:r>
+        <w:t xml:space="preserve">badge with a breakdown tooltip</w:t>
+      </w:r>
+    </w:p>
+    <w:bookmarkEnd w:id="26"/>
+    <w:bookmarkStart w:id="27" w:name="shared-features"/>
+    <w:p>
+      <w:pPr>
+        <w:pStyle w:val="Heading3"/>
+      </w:pPr>
+      <w:r>
+        <w:t xml:space="preserve">Shared Features</w:t>
+      </w:r>
+    </w:p>
+    <w:p>
+      <w:pPr>
+        <w:numPr>
+          <w:ilvl w:val="0"/>
+          <w:numId w:val="1008"/>
+        </w:numPr>
+        <w:pStyle w:val="Compact"/>
+      </w:pPr>
+      <w:r>
+        <w:t xml:space="preserve">Export scopes: entire catalogue, specific fonds, by repository, custom (clipboard)</w:t>
+      </w:r>
+    </w:p>
+    <w:p>
+      <w:pPr>
+        <w:numPr>
+          <w:ilvl w:val="0"/>
+          <w:numId w:val="1008"/>
+        </w:numPr>
+        <w:pStyle w:val="Compact"/>
+      </w:pPr>
+      <w:r>
+        <w:t xml:space="preserve">Background processing with progress tracking (via QueueService or nohup fallback)</w:t>
+      </w:r>
+    </w:p>
+    <w:p>
+      <w:pPr>
+        <w:numPr>
+          <w:ilvl w:val="0"/>
+          <w:numId w:val="1008"/>
+        </w:numPr>
+        <w:pStyle w:val="Compact"/>
+      </w:pPr>
+      <w:r>
+        <w:t xml:space="preserve">Admin UI: 5-step export wizard + 3-step import wizard</w:t>
+      </w:r>
+    </w:p>
+    <w:p>
+      <w:pPr>
+        <w:numPr>
+          <w:ilvl w:val="0"/>
+          <w:numId w:val="1008"/>
         </w:numPr>
         <w:pStyle w:val="Compact"/>
       </w:pPr>
@@ -617,7 +846,7 @@
       <w:pPr>
         <w:numPr>
           <w:ilvl w:val="0"/>
-          <w:numId w:val="1006"/>
+          <w:numId w:val="1008"/>
         </w:numPr>
         <w:pStyle w:val="Compact"/>
       </w:pPr>
@@ -629,7 +858,7 @@
       <w:pPr>
         <w:numPr>
           <w:ilvl w:val="0"/>
-          <w:numId w:val="1006"/>
+          <w:numId w:val="1008"/>
         </w:numPr>
         <w:pStyle w:val="Compact"/>
       </w:pPr>
@@ -644,9 +873,9 @@
         </w:pict>
       </w:r>
     </w:p>
-    <w:bookmarkEnd w:id="25"/>
-    <w:bookmarkEnd w:id="26"/>
-    <w:bookmarkStart w:id="27" w:name="cli-commands"/>
+    <w:bookmarkEnd w:id="27"/>
+    <w:bookmarkEnd w:id="28"/>
+    <w:bookmarkStart w:id="29" w:name="cli-commands"/>
     <w:p>
       <w:pPr>
         <w:pStyle w:val="Heading2"/>
@@ -1111,8 +1340,8 @@
         </w:pict>
       </w:r>
     </w:p>
-    <w:bookmarkEnd w:id="27"/>
-    <w:bookmarkStart w:id="28" w:name="archive-export-package-structure"/>
+    <w:bookmarkEnd w:id="29"/>
+    <w:bookmarkStart w:id="30" w:name="archive-export-package-structure"/>
     <w:p>
       <w:pPr>
         <w:pStyle w:val="Heading2"/>
@@ -1292,6 +1521,15 @@
           <w:rStyle w:val="VerbatimChar"/>
         </w:rPr>
         <w:t xml:space="preserve">    menus.json               # Navigation structure (MPTT)</w:t>
+      </w:r>
+      <w:r>
+        <w:br/>
+      </w:r>
+      <w:r>
+        <w:rPr>
+          <w:rStyle w:val="VerbatimChar"/>
+        </w:rPr>
+        <w:t xml:space="preserve">    disclosure-summary.json  # What was withheld (per-category counts, exporting user, total)</w:t>
       </w:r>
       <w:r>
         <w:br/>
@@ -1310,8 +1548,8 @@
         </w:pict>
       </w:r>
     </w:p>
-    <w:bookmarkEnd w:id="28"/>
-    <w:bookmarkStart w:id="29" w:name="technical-requirements"/>
+    <w:bookmarkEnd w:id="30"/>
+    <w:bookmarkStart w:id="31" w:name="technical-requirements"/>
     <w:p>
       <w:pPr>
         <w:pStyle w:val="Heading2"/>
@@ -1324,7 +1562,7 @@
       <w:pPr>
         <w:numPr>
           <w:ilvl w:val="0"/>
-          <w:numId w:val="1007"/>
+          <w:numId w:val="1009"/>
         </w:numPr>
         <w:pStyle w:val="Compact"/>
       </w:pPr>
@@ -1336,7 +1574,7 @@
       <w:pPr>
         <w:numPr>
           <w:ilvl w:val="0"/>
-          <w:numId w:val="1007"/>
+          <w:numId w:val="1009"/>
         </w:numPr>
         <w:pStyle w:val="Compact"/>
       </w:pPr>
@@ -1348,7 +1586,7 @@
       <w:pPr>
         <w:numPr>
           <w:ilvl w:val="0"/>
-          <w:numId w:val="1007"/>
+          <w:numId w:val="1009"/>
         </w:numPr>
         <w:pStyle w:val="Compact"/>
       </w:pPr>
@@ -1360,7 +1598,7 @@
       <w:pPr>
         <w:numPr>
           <w:ilvl w:val="0"/>
-          <w:numId w:val="1007"/>
+          <w:numId w:val="1009"/>
         </w:numPr>
         <w:pStyle w:val="Compact"/>
       </w:pPr>
@@ -1375,8 +1613,8 @@
         </w:pict>
       </w:r>
     </w:p>
-    <w:bookmarkEnd w:id="29"/>
-    <w:bookmarkStart w:id="30" w:name="compliance-standards"/>
+    <w:bookmarkEnd w:id="31"/>
+    <w:bookmarkStart w:id="32" w:name="compliance-standards"/>
     <w:p>
       <w:pPr>
         <w:pStyle w:val="Heading2"/>
@@ -1388,7 +1626,7 @@
     <w:tbl>
       <w:tblPr>
         <w:tblStyle w:val="Table"/>
-        <w:tblW w:type="auto" w:w="0"/>
+        <w:tblW w:type="pct" w:w="5000"/>
         <w:tblLook w:firstRow="1" w:lastRow="0" w:firstColumn="0" w:lastColumn="0" w:noHBand="0" w:noVBand="0" w:val="0020"/>
         <w:jc w:val="start"/>
       </w:tblPr>
@@ -1555,6 +1793,58 @@
           </w:p>
         </w:tc>
       </w:tr>
+      <w:tr>
+        <w:tc>
+          <w:tcPr/>
+          <w:p>
+            <w:pPr>
+              <w:pStyle w:val="Compact"/>
+              <w:jc w:val="left"/>
+            </w:pPr>
+            <w:r>
+              <w:t xml:space="preserve">Access Control</w:t>
+            </w:r>
+          </w:p>
+        </w:tc>
+        <w:tc>
+          <w:tcPr/>
+          <w:p>
+            <w:pPr>
+              <w:pStyle w:val="Compact"/>
+              <w:jc w:val="left"/>
+            </w:pPr>
+            <w:r>
+              <w:t xml:space="preserve">Per-user view-rights scoping + confidentiality gate; withheld records logged per package</w:t>
+            </w:r>
+          </w:p>
+        </w:tc>
+      </w:tr>
+      <w:tr>
+        <w:tc>
+          <w:tcPr/>
+          <w:p>
+            <w:pPr>
+              <w:pStyle w:val="Compact"/>
+              <w:jc w:val="left"/>
+            </w:pPr>
+            <w:r>
+              <w:t xml:space="preserve">ICIP / TK</w:t>
+            </w:r>
+          </w:p>
+        </w:tc>
+        <w:tc>
+          <w:tcPr/>
+          <w:p>
+            <w:pPr>
+              <w:pStyle w:val="Compact"/>
+              <w:jc w:val="left"/>
+            </w:pPr>
+            <w:r>
+              <w:t xml:space="preserve">Culturally-restricted records honoured (never exported without authority)</w:t>
+            </w:r>
+          </w:p>
+        </w:tc>
+      </w:tr>
     </w:tbl>
     <w:p>
       <w:r>
@@ -1563,8 +1853,8 @@
         </w:pict>
       </w:r>
     </w:p>
-    <w:bookmarkEnd w:id="30"/>
-    <w:bookmarkStart w:id="33" w:name="admin-ui"/>
+    <w:bookmarkEnd w:id="32"/>
+    <w:bookmarkStart w:id="35" w:name="admin-ui"/>
     <w:p>
       <w:pPr>
         <w:pStyle w:val="Heading2"/>
@@ -1573,7 +1863,7 @@
         <w:t xml:space="preserve">Admin UI</w:t>
       </w:r>
     </w:p>
-    <w:bookmarkStart w:id="31" w:name="export-wizard"/>
+    <w:bookmarkStart w:id="33" w:name="export-wizard"/>
     <w:p>
       <w:pPr>
         <w:pStyle w:val="Heading3"/>
@@ -1620,7 +1910,7 @@
         <w:pStyle w:val="BodyText"/>
       </w:pPr>
       <w:r>
-        <w:t xml:space="preserve">4-step wizard:</w:t>
+        <w:t xml:space="preserve">5-step wizard:</w:t>
       </w:r>
       <w:r>
         <w:t xml:space="preserve"> </w:t>
@@ -1702,17 +1992,39 @@
           <w:bCs/>
           <w:b/>
         </w:rPr>
+        <w:t xml:space="preserve">Destination</w:t>
+      </w:r>
+      <w:r>
+        <w:t xml:space="preserve"> </w:t>
+      </w:r>
+      <w:r>
+        <w:t xml:space="preserve">— ZIP file, This computer (local folder/drive), or Server folder/drive</w:t>
+      </w:r>
+      <w:r>
+        <w:t xml:space="preserve"> </w:t>
+      </w:r>
+      <w:r>
+        <w:t xml:space="preserve">5.</w:t>
+      </w:r>
+      <w:r>
+        <w:t xml:space="preserve"> </w:t>
+      </w:r>
+      <w:r>
+        <w:rPr>
+          <w:bCs/>
+          <w:b/>
+        </w:rPr>
         <w:t xml:space="preserve">Generate</w:t>
       </w:r>
       <w:r>
         <w:t xml:space="preserve"> </w:t>
       </w:r>
       <w:r>
-        <w:t xml:space="preserve">— Review settings, start export, monitor progress</w:t>
-      </w:r>
-    </w:p>
-    <w:bookmarkEnd w:id="31"/>
-    <w:bookmarkStart w:id="32" w:name="import-wizard"/>
+        <w:t xml:space="preserve">— Review settings, start export, monitor progress; save-to-folder / download when done</w:t>
+      </w:r>
+    </w:p>
+    <w:bookmarkEnd w:id="33"/>
+    <w:bookmarkStart w:id="34" w:name="import-wizard"/>
     <w:p>
       <w:pPr>
         <w:pStyle w:val="Heading3"/>
@@ -1843,9 +2155,9 @@
         </w:pict>
       </w:r>
     </w:p>
-    <w:bookmarkEnd w:id="32"/>
-    <w:bookmarkEnd w:id="33"/>
-    <w:bookmarkStart w:id="34" w:name="database-tables"/>
+    <w:bookmarkEnd w:id="34"/>
+    <w:bookmarkEnd w:id="35"/>
+    <w:bookmarkStart w:id="36" w:name="database-tables"/>
     <w:p>
       <w:pPr>
         <w:pStyle w:val="Heading2"/>
@@ -2011,8 +2323,8 @@
         <w:t xml:space="preserve">https://www.theahg.co.za</w:t>
       </w:r>
     </w:p>
-    <w:bookmarkEnd w:id="34"/>
-    <w:bookmarkEnd w:id="35"/>
+    <w:bookmarkEnd w:id="36"/>
+    <w:bookmarkEnd w:id="37"/>
     <w:sectPr/>
   </w:body>
 </w:document>
@@ -2329,6 +2641,12 @@
     <w:abstractNumId w:val="991"/>
   </w:num>
   <w:num w:numId="1007">
+    <w:abstractNumId w:val="991"/>
+  </w:num>
+  <w:num w:numId="1008">
+    <w:abstractNumId w:val="991"/>
+  </w:num>
+  <w:num w:numId="1009">
     <w:abstractNumId w:val="991"/>
   </w:num>
 </w:numbering>

</xml_diff>